<commit_message>
Handover package v2.2: feature guide with screenshots, diagrams, privacy/OWASP/WCAG standards, knowledge transfer plan
</commit_message>
<xml_diff>
--- a/handover/01-Product-Document.docx
+++ b/handover/01-Product-Document.docx
@@ -38,11 +38,12 @@
           <w:color w:val="6B6455"/>
           <w:sz w:val="20"/>
         </w:rPr>
-        <w:t>Version 2.1 · 13 October 2026 (living document -- updated each iteration) | Team TE38 · BitDance | FIT5120, Monash University</w:t>
+        <w:t>Version 2.2 · 15 October 2026 (living document -- updated each iteration) | Team TE38 · BitDance | FIT5120, Monash University</w:t>
       </w:r>
     </w:p>
     <w:p>
       <w:pPr>
+        <w:keepNext/>
         <w:spacing w:before="280" w:after="120"/>
       </w:pPr>
       <w:r>
@@ -69,6 +70,62 @@
     </w:p>
     <w:p>
       <w:pPr>
+        <w:keepNext/>
+        <w:spacing w:before="80" w:after="40"/>
+        <w:jc w:val="center"/>
+      </w:pPr>
+      <w:r>
+        <w:drawing>
+          <wp:inline xmlns:a="http://schemas.openxmlformats.org/drawingml/2006/main" xmlns:pic="http://schemas.openxmlformats.org/drawingml/2006/picture">
+            <wp:extent cx="3780000" cy="2362500"/>
+            <wp:docPr id="1" name="Picture 1"/>
+            <wp:cNvGraphicFramePr>
+              <a:graphicFrameLocks noChangeAspect="1"/>
+            </wp:cNvGraphicFramePr>
+            <a:graphic>
+              <a:graphicData uri="http://schemas.openxmlformats.org/drawingml/2006/picture">
+                <pic:pic>
+                  <pic:nvPicPr>
+                    <pic:cNvPr id="0" name="image.jpg"/>
+                    <pic:cNvPicPr/>
+                  </pic:nvPicPr>
+                  <pic:blipFill>
+                    <a:blip r:embed="rId9"/>
+                    <a:stretch>
+                      <a:fillRect/>
+                    </a:stretch>
+                  </pic:blipFill>
+                  <pic:spPr>
+                    <a:xfrm>
+                      <a:off x="0" y="0"/>
+                      <a:ext cx="3780000" cy="2362500"/>
+                    </a:xfrm>
+                    <a:prstGeom prst="rect"/>
+                  </pic:spPr>
+                </pic:pic>
+              </a:graphicData>
+            </a:graphic>
+          </wp:inline>
+        </w:drawing>
+      </w:r>
+    </w:p>
+    <w:p>
+      <w:pPr>
+        <w:spacing w:after="200"/>
+        <w:jc w:val="center"/>
+      </w:pPr>
+      <w:r>
+        <w:rPr>
+          <w:i/>
+          <w:color w:val="6B6455"/>
+          <w:sz w:val="18"/>
+        </w:rPr>
+        <w:t>Figure 1. The home page states what HandMirror is and who it is for within the first screen.</w:t>
+      </w:r>
+    </w:p>
+    <w:p>
+      <w:pPr>
+        <w:keepNext/>
         <w:spacing w:before="160" w:after="80"/>
       </w:pPr>
       <w:r>
@@ -95,6 +152,7 @@
     </w:p>
     <w:p>
       <w:pPr>
+        <w:keepNext/>
         <w:spacing w:before="160" w:after="80"/>
       </w:pPr>
       <w:r>
@@ -121,6 +179,7 @@
     </w:p>
     <w:p>
       <w:pPr>
+        <w:keepNext/>
         <w:spacing w:before="160" w:after="80"/>
       </w:pPr>
       <w:r>
@@ -147,6 +206,7 @@
     </w:p>
     <w:p>
       <w:pPr>
+        <w:keepNext/>
         <w:spacing w:before="280" w:after="120"/>
       </w:pPr>
       <w:r>
@@ -184,13 +244,16 @@
             <w:tcW w:type="dxa" w:w="2600"/>
             <w:shd w:val="clear" w:color="auto" w:fill="1F3D7A"/>
             <w:tcMar>
-              <w:top w:w="100" w:type="dxa"/>
-              <w:bottom w:w="100" w:type="dxa"/>
-              <w:start w:w="140" w:type="dxa"/>
-              <w:end w:w="140" w:type="dxa"/>
+              <w:top w:w="60" w:type="dxa"/>
+              <w:bottom w:w="60" w:type="dxa"/>
+              <w:start w:w="120" w:type="dxa"/>
+              <w:end w:w="120" w:type="dxa"/>
             </w:tcMar>
           </w:tcPr>
           <w:p>
+            <w:pPr>
+              <w:spacing w:after="0"/>
+            </w:pPr>
             <w:r>
               <w:rPr>
                 <w:b/>
@@ -207,13 +270,16 @@
             <w:tcW w:type="dxa" w:w="1300"/>
             <w:shd w:val="clear" w:color="auto" w:fill="1F3D7A"/>
             <w:tcMar>
-              <w:top w:w="100" w:type="dxa"/>
-              <w:bottom w:w="100" w:type="dxa"/>
-              <w:start w:w="140" w:type="dxa"/>
-              <w:end w:w="140" w:type="dxa"/>
+              <w:top w:w="60" w:type="dxa"/>
+              <w:bottom w:w="60" w:type="dxa"/>
+              <w:start w:w="120" w:type="dxa"/>
+              <w:end w:w="120" w:type="dxa"/>
             </w:tcMar>
           </w:tcPr>
           <w:p>
+            <w:pPr>
+              <w:spacing w:after="0"/>
+            </w:pPr>
             <w:r>
               <w:rPr>
                 <w:b/>
@@ -230,13 +296,16 @@
             <w:tcW w:type="dxa" w:w="6072"/>
             <w:shd w:val="clear" w:color="auto" w:fill="1F3D7A"/>
             <w:tcMar>
-              <w:top w:w="100" w:type="dxa"/>
-              <w:bottom w:w="100" w:type="dxa"/>
-              <w:start w:w="140" w:type="dxa"/>
-              <w:end w:w="140" w:type="dxa"/>
+              <w:top w:w="60" w:type="dxa"/>
+              <w:bottom w:w="60" w:type="dxa"/>
+              <w:start w:w="120" w:type="dxa"/>
+              <w:end w:w="120" w:type="dxa"/>
             </w:tcMar>
           </w:tcPr>
           <w:p>
+            <w:pPr>
+              <w:spacing w:after="0"/>
+            </w:pPr>
             <w:r>
               <w:rPr>
                 <w:b/>
@@ -255,13 +324,16 @@
             <w:tcW w:type="dxa" w:w="2600"/>
             <w:shd w:val="clear" w:color="auto" w:fill="FFFFFF"/>
             <w:tcMar>
-              <w:top w:w="100" w:type="dxa"/>
-              <w:bottom w:w="100" w:type="dxa"/>
-              <w:start w:w="140" w:type="dxa"/>
-              <w:end w:w="140" w:type="dxa"/>
+              <w:top w:w="60" w:type="dxa"/>
+              <w:bottom w:w="60" w:type="dxa"/>
+              <w:start w:w="120" w:type="dxa"/>
+              <w:end w:w="120" w:type="dxa"/>
             </w:tcMar>
           </w:tcPr>
           <w:p>
+            <w:pPr>
+              <w:spacing w:after="0"/>
+            </w:pPr>
             <w:r>
               <w:rPr>
                 <w:color w:val="201E19"/>
@@ -277,13 +349,16 @@
             <w:tcW w:type="dxa" w:w="1300"/>
             <w:shd w:val="clear" w:color="auto" w:fill="FFFFFF"/>
             <w:tcMar>
-              <w:top w:w="100" w:type="dxa"/>
-              <w:bottom w:w="100" w:type="dxa"/>
-              <w:start w:w="140" w:type="dxa"/>
-              <w:end w:w="140" w:type="dxa"/>
+              <w:top w:w="60" w:type="dxa"/>
+              <w:bottom w:w="60" w:type="dxa"/>
+              <w:start w:w="120" w:type="dxa"/>
+              <w:end w:w="120" w:type="dxa"/>
             </w:tcMar>
           </w:tcPr>
           <w:p>
+            <w:pPr>
+              <w:spacing w:after="0"/>
+            </w:pPr>
             <w:r>
               <w:rPr>
                 <w:color w:val="201E19"/>
@@ -299,19 +374,22 @@
             <w:tcW w:type="dxa" w:w="6072"/>
             <w:shd w:val="clear" w:color="auto" w:fill="FFFFFF"/>
             <w:tcMar>
-              <w:top w:w="100" w:type="dxa"/>
-              <w:bottom w:w="100" w:type="dxa"/>
-              <w:start w:w="140" w:type="dxa"/>
-              <w:end w:w="140" w:type="dxa"/>
+              <w:top w:w="60" w:type="dxa"/>
+              <w:bottom w:w="60" w:type="dxa"/>
+              <w:start w:w="120" w:type="dxa"/>
+              <w:end w:w="120" w:type="dxa"/>
             </w:tcMar>
           </w:tcPr>
           <w:p>
+            <w:pPr>
+              <w:spacing w:after="0"/>
+            </w:pPr>
             <w:r>
               <w:rPr>
                 <w:color w:val="201E19"/>
                 <w:sz w:val="19"/>
               </w:rPr>
-              <w:t>Keyword search across gloss, tags, keywords and definitions; topic browsing; difficulty-level filter and sort; pagination; sign-to-search (sign at the webcam and pick from the four closest signs).</w:t>
+              <w:t>Keyword search across gloss, tags, keywords and definitions; topic browsing; difficulty-level filter and sort; pagination; sign-to-search (sign at the webcam and pick from the four closest signs); select several signs at once and add them to To Learn or mark them learnt.</w:t>
             </w:r>
           </w:p>
         </w:tc>
@@ -323,13 +401,16 @@
             <w:tcW w:type="dxa" w:w="2600"/>
             <w:shd w:val="clear" w:color="auto" w:fill="FFFFFF"/>
             <w:tcMar>
-              <w:top w:w="100" w:type="dxa"/>
-              <w:bottom w:w="100" w:type="dxa"/>
-              <w:start w:w="140" w:type="dxa"/>
-              <w:end w:w="140" w:type="dxa"/>
+              <w:top w:w="60" w:type="dxa"/>
+              <w:bottom w:w="60" w:type="dxa"/>
+              <w:start w:w="120" w:type="dxa"/>
+              <w:end w:w="120" w:type="dxa"/>
             </w:tcMar>
           </w:tcPr>
           <w:p>
+            <w:pPr>
+              <w:spacing w:after="0"/>
+            </w:pPr>
             <w:r>
               <w:rPr>
                 <w:color w:val="201E19"/>
@@ -345,13 +426,16 @@
             <w:tcW w:type="dxa" w:w="1300"/>
             <w:shd w:val="clear" w:color="auto" w:fill="FFFFFF"/>
             <w:tcMar>
-              <w:top w:w="100" w:type="dxa"/>
-              <w:bottom w:w="100" w:type="dxa"/>
-              <w:start w:w="140" w:type="dxa"/>
-              <w:end w:w="140" w:type="dxa"/>
+              <w:top w:w="60" w:type="dxa"/>
+              <w:bottom w:w="60" w:type="dxa"/>
+              <w:start w:w="120" w:type="dxa"/>
+              <w:end w:w="120" w:type="dxa"/>
             </w:tcMar>
           </w:tcPr>
           <w:p>
+            <w:pPr>
+              <w:spacing w:after="0"/>
+            </w:pPr>
             <w:r>
               <w:rPr>
                 <w:color w:val="201E19"/>
@@ -367,19 +451,22 @@
             <w:tcW w:type="dxa" w:w="6072"/>
             <w:shd w:val="clear" w:color="auto" w:fill="FFFFFF"/>
             <w:tcMar>
-              <w:top w:w="100" w:type="dxa"/>
-              <w:bottom w:w="100" w:type="dxa"/>
-              <w:start w:w="140" w:type="dxa"/>
-              <w:end w:w="140" w:type="dxa"/>
+              <w:top w:w="60" w:type="dxa"/>
+              <w:bottom w:w="60" w:type="dxa"/>
+              <w:start w:w="120" w:type="dxa"/>
+              <w:end w:w="120" w:type="dxa"/>
             </w:tcMar>
           </w:tcPr>
           <w:p>
+            <w:pPr>
+              <w:spacing w:after="0"/>
+            </w:pPr>
             <w:r>
               <w:rPr>
                 <w:color w:val="201E19"/>
                 <w:sz w:val="19"/>
               </w:rPr>
-              <w:t>Real signer video for every sign (0.5×–2× speed), a step-by-step movement description, a rotatable 3D avatar playing the sign, and Mark-as-learned.</w:t>
+              <w:t>Real signer video for every sign (0.5×–2× speed), a step-by-step movement description, a rotatable 3D avatar playing the sign, Mark as learnt, and + / ✓ buttons on every sign card for one-click saving.</w:t>
             </w:r>
           </w:p>
         </w:tc>
@@ -391,13 +478,16 @@
             <w:tcW w:type="dxa" w:w="2600"/>
             <w:shd w:val="clear" w:color="auto" w:fill="FFFFFF"/>
             <w:tcMar>
-              <w:top w:w="100" w:type="dxa"/>
-              <w:bottom w:w="100" w:type="dxa"/>
-              <w:start w:w="140" w:type="dxa"/>
-              <w:end w:w="140" w:type="dxa"/>
+              <w:top w:w="60" w:type="dxa"/>
+              <w:bottom w:w="60" w:type="dxa"/>
+              <w:start w:w="120" w:type="dxa"/>
+              <w:end w:w="120" w:type="dxa"/>
             </w:tcMar>
           </w:tcPr>
           <w:p>
+            <w:pPr>
+              <w:spacing w:after="0"/>
+            </w:pPr>
             <w:r>
               <w:rPr>
                 <w:color w:val="201E19"/>
@@ -413,13 +503,16 @@
             <w:tcW w:type="dxa" w:w="1300"/>
             <w:shd w:val="clear" w:color="auto" w:fill="FFFFFF"/>
             <w:tcMar>
-              <w:top w:w="100" w:type="dxa"/>
-              <w:bottom w:w="100" w:type="dxa"/>
-              <w:start w:w="140" w:type="dxa"/>
-              <w:end w:w="140" w:type="dxa"/>
+              <w:top w:w="60" w:type="dxa"/>
+              <w:bottom w:w="60" w:type="dxa"/>
+              <w:start w:w="120" w:type="dxa"/>
+              <w:end w:w="120" w:type="dxa"/>
             </w:tcMar>
           </w:tcPr>
           <w:p>
+            <w:pPr>
+              <w:spacing w:after="0"/>
+            </w:pPr>
             <w:r>
               <w:rPr>
                 <w:color w:val="201E19"/>
@@ -435,13 +528,16 @@
             <w:tcW w:type="dxa" w:w="6072"/>
             <w:shd w:val="clear" w:color="auto" w:fill="FFFFFF"/>
             <w:tcMar>
-              <w:top w:w="100" w:type="dxa"/>
-              <w:bottom w:w="100" w:type="dxa"/>
-              <w:start w:w="140" w:type="dxa"/>
-              <w:end w:w="140" w:type="dxa"/>
+              <w:top w:w="60" w:type="dxa"/>
+              <w:bottom w:w="60" w:type="dxa"/>
+              <w:start w:w="120" w:type="dxa"/>
+              <w:end w:w="120" w:type="dxa"/>
             </w:tcMar>
           </w:tcPr>
           <w:p>
+            <w:pPr>
+              <w:spacing w:after="0"/>
+            </w:pPr>
             <w:r>
               <w:rPr>
                 <w:color w:val="201E19"/>
@@ -459,13 +555,16 @@
             <w:tcW w:type="dxa" w:w="2600"/>
             <w:shd w:val="clear" w:color="auto" w:fill="FFFFFF"/>
             <w:tcMar>
-              <w:top w:w="100" w:type="dxa"/>
-              <w:bottom w:w="100" w:type="dxa"/>
-              <w:start w:w="140" w:type="dxa"/>
-              <w:end w:w="140" w:type="dxa"/>
+              <w:top w:w="60" w:type="dxa"/>
+              <w:bottom w:w="60" w:type="dxa"/>
+              <w:start w:w="120" w:type="dxa"/>
+              <w:end w:w="120" w:type="dxa"/>
             </w:tcMar>
           </w:tcPr>
           <w:p>
+            <w:pPr>
+              <w:spacing w:after="0"/>
+            </w:pPr>
             <w:r>
               <w:rPr>
                 <w:color w:val="201E19"/>
@@ -481,13 +580,16 @@
             <w:tcW w:type="dxa" w:w="1300"/>
             <w:shd w:val="clear" w:color="auto" w:fill="FFFFFF"/>
             <w:tcMar>
-              <w:top w:w="100" w:type="dxa"/>
-              <w:bottom w:w="100" w:type="dxa"/>
-              <w:start w:w="140" w:type="dxa"/>
-              <w:end w:w="140" w:type="dxa"/>
+              <w:top w:w="60" w:type="dxa"/>
+              <w:bottom w:w="60" w:type="dxa"/>
+              <w:start w:w="120" w:type="dxa"/>
+              <w:end w:w="120" w:type="dxa"/>
             </w:tcMar>
           </w:tcPr>
           <w:p>
+            <w:pPr>
+              <w:spacing w:after="0"/>
+            </w:pPr>
             <w:r>
               <w:rPr>
                 <w:color w:val="201E19"/>
@@ -503,13 +605,16 @@
             <w:tcW w:type="dxa" w:w="6072"/>
             <w:shd w:val="clear" w:color="auto" w:fill="FFFFFF"/>
             <w:tcMar>
-              <w:top w:w="100" w:type="dxa"/>
-              <w:bottom w:w="100" w:type="dxa"/>
-              <w:start w:w="140" w:type="dxa"/>
-              <w:end w:w="140" w:type="dxa"/>
+              <w:top w:w="60" w:type="dxa"/>
+              <w:bottom w:w="60" w:type="dxa"/>
+              <w:start w:w="120" w:type="dxa"/>
+              <w:end w:w="120" w:type="dxa"/>
             </w:tcMar>
           </w:tcPr>
           <w:p>
+            <w:pPr>
+              <w:spacing w:after="0"/>
+            </w:pPr>
             <w:r>
               <w:rPr>
                 <w:color w:val="201E19"/>
@@ -527,13 +632,16 @@
             <w:tcW w:type="dxa" w:w="2600"/>
             <w:shd w:val="clear" w:color="auto" w:fill="FFFFFF"/>
             <w:tcMar>
-              <w:top w:w="100" w:type="dxa"/>
-              <w:bottom w:w="100" w:type="dxa"/>
-              <w:start w:w="140" w:type="dxa"/>
-              <w:end w:w="140" w:type="dxa"/>
+              <w:top w:w="60" w:type="dxa"/>
+              <w:bottom w:w="60" w:type="dxa"/>
+              <w:start w:w="120" w:type="dxa"/>
+              <w:end w:w="120" w:type="dxa"/>
             </w:tcMar>
           </w:tcPr>
           <w:p>
+            <w:pPr>
+              <w:spacing w:after="0"/>
+            </w:pPr>
             <w:r>
               <w:rPr>
                 <w:color w:val="201E19"/>
@@ -549,13 +657,16 @@
             <w:tcW w:type="dxa" w:w="1300"/>
             <w:shd w:val="clear" w:color="auto" w:fill="FFFFFF"/>
             <w:tcMar>
-              <w:top w:w="100" w:type="dxa"/>
-              <w:bottom w:w="100" w:type="dxa"/>
-              <w:start w:w="140" w:type="dxa"/>
-              <w:end w:w="140" w:type="dxa"/>
+              <w:top w:w="60" w:type="dxa"/>
+              <w:bottom w:w="60" w:type="dxa"/>
+              <w:start w:w="120" w:type="dxa"/>
+              <w:end w:w="120" w:type="dxa"/>
             </w:tcMar>
           </w:tcPr>
           <w:p>
+            <w:pPr>
+              <w:spacing w:after="0"/>
+            </w:pPr>
             <w:r>
               <w:rPr>
                 <w:color w:val="201E19"/>
@@ -571,19 +682,22 @@
             <w:tcW w:type="dxa" w:w="6072"/>
             <w:shd w:val="clear" w:color="auto" w:fill="FFFFFF"/>
             <w:tcMar>
-              <w:top w:w="100" w:type="dxa"/>
-              <w:bottom w:w="100" w:type="dxa"/>
-              <w:start w:w="140" w:type="dxa"/>
-              <w:end w:w="140" w:type="dxa"/>
+              <w:top w:w="60" w:type="dxa"/>
+              <w:bottom w:w="60" w:type="dxa"/>
+              <w:start w:w="120" w:type="dxa"/>
+              <w:end w:w="120" w:type="dxa"/>
             </w:tcMar>
           </w:tcPr>
           <w:p>
+            <w:pPr>
+              <w:spacing w:after="0"/>
+            </w:pPr>
             <w:r>
               <w:rPr>
                 <w:color w:val="201E19"/>
                 <w:sz w:val="19"/>
               </w:rPr>
-              <w:t>To Learn list (grouped by when signs were added), a personalise wizard (pick topics, a word count and its split; it fills the list with signs not yet learned), and a Learned list with progress.</w:t>
+              <w:t>To Learn list (grouped by when signs were added), a personalise wizard (pick topics, a word count and its split; it fills the list with signs not yet learnt), and a Learnt list with progress.</w:t>
             </w:r>
           </w:p>
         </w:tc>
@@ -595,13 +709,16 @@
             <w:tcW w:type="dxa" w:w="2600"/>
             <w:shd w:val="clear" w:color="auto" w:fill="FFFFFF"/>
             <w:tcMar>
-              <w:top w:w="100" w:type="dxa"/>
-              <w:bottom w:w="100" w:type="dxa"/>
-              <w:start w:w="140" w:type="dxa"/>
-              <w:end w:w="140" w:type="dxa"/>
+              <w:top w:w="60" w:type="dxa"/>
+              <w:bottom w:w="60" w:type="dxa"/>
+              <w:start w:w="120" w:type="dxa"/>
+              <w:end w:w="120" w:type="dxa"/>
             </w:tcMar>
           </w:tcPr>
           <w:p>
+            <w:pPr>
+              <w:spacing w:after="0"/>
+            </w:pPr>
             <w:r>
               <w:rPr>
                 <w:color w:val="201E19"/>
@@ -617,13 +734,16 @@
             <w:tcW w:type="dxa" w:w="1300"/>
             <w:shd w:val="clear" w:color="auto" w:fill="FFFFFF"/>
             <w:tcMar>
-              <w:top w:w="100" w:type="dxa"/>
-              <w:bottom w:w="100" w:type="dxa"/>
-              <w:start w:w="140" w:type="dxa"/>
-              <w:end w:w="140" w:type="dxa"/>
+              <w:top w:w="60" w:type="dxa"/>
+              <w:bottom w:w="60" w:type="dxa"/>
+              <w:start w:w="120" w:type="dxa"/>
+              <w:end w:w="120" w:type="dxa"/>
             </w:tcMar>
           </w:tcPr>
           <w:p>
+            <w:pPr>
+              <w:spacing w:after="0"/>
+            </w:pPr>
             <w:r>
               <w:rPr>
                 <w:color w:val="201E19"/>
@@ -639,13 +759,16 @@
             <w:tcW w:type="dxa" w:w="6072"/>
             <w:shd w:val="clear" w:color="auto" w:fill="FFFFFF"/>
             <w:tcMar>
-              <w:top w:w="100" w:type="dxa"/>
-              <w:bottom w:w="100" w:type="dxa"/>
-              <w:start w:w="140" w:type="dxa"/>
-              <w:end w:w="140" w:type="dxa"/>
+              <w:top w:w="60" w:type="dxa"/>
+              <w:bottom w:w="60" w:type="dxa"/>
+              <w:start w:w="120" w:type="dxa"/>
+              <w:end w:w="120" w:type="dxa"/>
             </w:tcMar>
           </w:tcPr>
           <w:p>
+            <w:pPr>
+              <w:spacing w:after="0"/>
+            </w:pPr>
             <w:r>
               <w:rPr>
                 <w:color w:val="201E19"/>
@@ -663,13 +786,16 @@
             <w:tcW w:type="dxa" w:w="2600"/>
             <w:shd w:val="clear" w:color="auto" w:fill="FFFFFF"/>
             <w:tcMar>
-              <w:top w:w="100" w:type="dxa"/>
-              <w:bottom w:w="100" w:type="dxa"/>
-              <w:start w:w="140" w:type="dxa"/>
-              <w:end w:w="140" w:type="dxa"/>
+              <w:top w:w="60" w:type="dxa"/>
+              <w:bottom w:w="60" w:type="dxa"/>
+              <w:start w:w="120" w:type="dxa"/>
+              <w:end w:w="120" w:type="dxa"/>
             </w:tcMar>
           </w:tcPr>
           <w:p>
+            <w:pPr>
+              <w:spacing w:after="0"/>
+            </w:pPr>
             <w:r>
               <w:rPr>
                 <w:color w:val="201E19"/>
@@ -685,13 +811,16 @@
             <w:tcW w:type="dxa" w:w="1300"/>
             <w:shd w:val="clear" w:color="auto" w:fill="FFFFFF"/>
             <w:tcMar>
-              <w:top w:w="100" w:type="dxa"/>
-              <w:bottom w:w="100" w:type="dxa"/>
-              <w:start w:w="140" w:type="dxa"/>
-              <w:end w:w="140" w:type="dxa"/>
+              <w:top w:w="60" w:type="dxa"/>
+              <w:bottom w:w="60" w:type="dxa"/>
+              <w:start w:w="120" w:type="dxa"/>
+              <w:end w:w="120" w:type="dxa"/>
             </w:tcMar>
           </w:tcPr>
           <w:p>
+            <w:pPr>
+              <w:spacing w:after="0"/>
+            </w:pPr>
             <w:r>
               <w:rPr>
                 <w:color w:val="201E19"/>
@@ -707,13 +836,16 @@
             <w:tcW w:type="dxa" w:w="6072"/>
             <w:shd w:val="clear" w:color="auto" w:fill="FFFFFF"/>
             <w:tcMar>
-              <w:top w:w="100" w:type="dxa"/>
-              <w:bottom w:w="100" w:type="dxa"/>
-              <w:start w:w="140" w:type="dxa"/>
-              <w:end w:w="140" w:type="dxa"/>
+              <w:top w:w="60" w:type="dxa"/>
+              <w:bottom w:w="60" w:type="dxa"/>
+              <w:start w:w="120" w:type="dxa"/>
+              <w:end w:w="120" w:type="dxa"/>
             </w:tcMar>
           </w:tcPr>
           <w:p>
+            <w:pPr>
+              <w:spacing w:after="0"/>
+            </w:pPr>
             <w:r>
               <w:rPr>
                 <w:color w:val="201E19"/>
@@ -732,6 +864,7 @@
     </w:p>
     <w:p>
       <w:pPr>
+        <w:keepNext/>
         <w:spacing w:before="280" w:after="120"/>
       </w:pPr>
       <w:r>
@@ -766,11 +899,12 @@
           <w:color w:val="201E19"/>
           <w:sz w:val="21"/>
         </w:rPr>
-        <w:t>Live product: https://handmirror.vercel.app   |   Source code: https://github.com/randlyoyo/FIT5120-TE38-SignLanguage</w:t>
+        <w:t>Live product: https://handmirror.vercel.app (public -- no account, login or password is needed)   |   Source code: https://github.com/randlyoyo/FIT5120-TE38-SignLanguage</w:t>
       </w:r>
     </w:p>
     <w:p>
       <w:pPr>
+        <w:keepNext/>
         <w:spacing w:before="280" w:after="120"/>
       </w:pPr>
       <w:r>
@@ -784,6 +918,7 @@
     </w:p>
     <w:p>
       <w:pPr>
+        <w:keepNext/>
         <w:spacing w:before="160" w:after="80"/>
       </w:pPr>
       <w:r>
@@ -834,13 +969,16 @@
             <w:tcW w:type="dxa" w:w="2400"/>
             <w:shd w:val="clear" w:color="auto" w:fill="1F3D7A"/>
             <w:tcMar>
-              <w:top w:w="100" w:type="dxa"/>
-              <w:bottom w:w="100" w:type="dxa"/>
-              <w:start w:w="140" w:type="dxa"/>
-              <w:end w:w="140" w:type="dxa"/>
+              <w:top w:w="60" w:type="dxa"/>
+              <w:bottom w:w="60" w:type="dxa"/>
+              <w:start w:w="120" w:type="dxa"/>
+              <w:end w:w="120" w:type="dxa"/>
             </w:tcMar>
           </w:tcPr>
           <w:p>
+            <w:pPr>
+              <w:spacing w:after="0"/>
+            </w:pPr>
             <w:r>
               <w:rPr>
                 <w:b/>
@@ -857,13 +995,16 @@
             <w:tcW w:type="dxa" w:w="4300"/>
             <w:shd w:val="clear" w:color="auto" w:fill="1F3D7A"/>
             <w:tcMar>
-              <w:top w:w="100" w:type="dxa"/>
-              <w:bottom w:w="100" w:type="dxa"/>
-              <w:start w:w="140" w:type="dxa"/>
-              <w:end w:w="140" w:type="dxa"/>
+              <w:top w:w="60" w:type="dxa"/>
+              <w:bottom w:w="60" w:type="dxa"/>
+              <w:start w:w="120" w:type="dxa"/>
+              <w:end w:w="120" w:type="dxa"/>
             </w:tcMar>
           </w:tcPr>
           <w:p>
+            <w:pPr>
+              <w:spacing w:after="0"/>
+            </w:pPr>
             <w:r>
               <w:rPr>
                 <w:b/>
@@ -880,13 +1021,16 @@
             <w:tcW w:type="dxa" w:w="3272"/>
             <w:shd w:val="clear" w:color="auto" w:fill="1F3D7A"/>
             <w:tcMar>
-              <w:top w:w="100" w:type="dxa"/>
-              <w:bottom w:w="100" w:type="dxa"/>
-              <w:start w:w="140" w:type="dxa"/>
-              <w:end w:w="140" w:type="dxa"/>
+              <w:top w:w="60" w:type="dxa"/>
+              <w:bottom w:w="60" w:type="dxa"/>
+              <w:start w:w="120" w:type="dxa"/>
+              <w:end w:w="120" w:type="dxa"/>
             </w:tcMar>
           </w:tcPr>
           <w:p>
+            <w:pPr>
+              <w:spacing w:after="0"/>
+            </w:pPr>
             <w:r>
               <w:rPr>
                 <w:b/>
@@ -905,13 +1049,16 @@
             <w:tcW w:type="dxa" w:w="2400"/>
             <w:shd w:val="clear" w:color="auto" w:fill="FFFFFF"/>
             <w:tcMar>
-              <w:top w:w="100" w:type="dxa"/>
-              <w:bottom w:w="100" w:type="dxa"/>
-              <w:start w:w="140" w:type="dxa"/>
-              <w:end w:w="140" w:type="dxa"/>
+              <w:top w:w="60" w:type="dxa"/>
+              <w:bottom w:w="60" w:type="dxa"/>
+              <w:start w:w="120" w:type="dxa"/>
+              <w:end w:w="120" w:type="dxa"/>
             </w:tcMar>
           </w:tcPr>
           <w:p>
+            <w:pPr>
+              <w:spacing w:after="0"/>
+            </w:pPr>
             <w:r>
               <w:rPr>
                 <w:color w:val="201E19"/>
@@ -927,13 +1074,16 @@
             <w:tcW w:type="dxa" w:w="4300"/>
             <w:shd w:val="clear" w:color="auto" w:fill="FFFFFF"/>
             <w:tcMar>
-              <w:top w:w="100" w:type="dxa"/>
-              <w:bottom w:w="100" w:type="dxa"/>
-              <w:start w:w="140" w:type="dxa"/>
-              <w:end w:w="140" w:type="dxa"/>
+              <w:top w:w="60" w:type="dxa"/>
+              <w:bottom w:w="60" w:type="dxa"/>
+              <w:start w:w="120" w:type="dxa"/>
+              <w:end w:w="120" w:type="dxa"/>
             </w:tcMar>
           </w:tcPr>
           <w:p>
+            <w:pPr>
+              <w:spacing w:after="0"/>
+            </w:pPr>
             <w:r>
               <w:rPr>
                 <w:color w:val="201E19"/>
@@ -949,13 +1099,16 @@
             <w:tcW w:type="dxa" w:w="3272"/>
             <w:shd w:val="clear" w:color="auto" w:fill="FFFFFF"/>
             <w:tcMar>
-              <w:top w:w="100" w:type="dxa"/>
-              <w:bottom w:w="100" w:type="dxa"/>
-              <w:start w:w="140" w:type="dxa"/>
-              <w:end w:w="140" w:type="dxa"/>
+              <w:top w:w="60" w:type="dxa"/>
+              <w:bottom w:w="60" w:type="dxa"/>
+              <w:start w:w="120" w:type="dxa"/>
+              <w:end w:w="120" w:type="dxa"/>
             </w:tcMar>
           </w:tcPr>
           <w:p>
+            <w:pPr>
+              <w:spacing w:after="0"/>
+            </w:pPr>
             <w:r>
               <w:rPr>
                 <w:color w:val="201E19"/>
@@ -973,13 +1126,16 @@
             <w:tcW w:type="dxa" w:w="2400"/>
             <w:shd w:val="clear" w:color="auto" w:fill="FFFFFF"/>
             <w:tcMar>
-              <w:top w:w="100" w:type="dxa"/>
-              <w:bottom w:w="100" w:type="dxa"/>
-              <w:start w:w="140" w:type="dxa"/>
-              <w:end w:w="140" w:type="dxa"/>
+              <w:top w:w="60" w:type="dxa"/>
+              <w:bottom w:w="60" w:type="dxa"/>
+              <w:start w:w="120" w:type="dxa"/>
+              <w:end w:w="120" w:type="dxa"/>
             </w:tcMar>
           </w:tcPr>
           <w:p>
+            <w:pPr>
+              <w:spacing w:after="0"/>
+            </w:pPr>
             <w:r>
               <w:rPr>
                 <w:color w:val="201E19"/>
@@ -995,13 +1151,16 @@
             <w:tcW w:type="dxa" w:w="4300"/>
             <w:shd w:val="clear" w:color="auto" w:fill="FFFFFF"/>
             <w:tcMar>
-              <w:top w:w="100" w:type="dxa"/>
-              <w:bottom w:w="100" w:type="dxa"/>
-              <w:start w:w="140" w:type="dxa"/>
-              <w:end w:w="140" w:type="dxa"/>
+              <w:top w:w="60" w:type="dxa"/>
+              <w:bottom w:w="60" w:type="dxa"/>
+              <w:start w:w="120" w:type="dxa"/>
+              <w:end w:w="120" w:type="dxa"/>
             </w:tcMar>
           </w:tcPr>
           <w:p>
+            <w:pPr>
+              <w:spacing w:after="0"/>
+            </w:pPr>
             <w:r>
               <w:rPr>
                 <w:color w:val="201E19"/>
@@ -1017,13 +1176,16 @@
             <w:tcW w:type="dxa" w:w="3272"/>
             <w:shd w:val="clear" w:color="auto" w:fill="FFFFFF"/>
             <w:tcMar>
-              <w:top w:w="100" w:type="dxa"/>
-              <w:bottom w:w="100" w:type="dxa"/>
-              <w:start w:w="140" w:type="dxa"/>
-              <w:end w:w="140" w:type="dxa"/>
+              <w:top w:w="60" w:type="dxa"/>
+              <w:bottom w:w="60" w:type="dxa"/>
+              <w:start w:w="120" w:type="dxa"/>
+              <w:end w:w="120" w:type="dxa"/>
             </w:tcMar>
           </w:tcPr>
           <w:p>
+            <w:pPr>
+              <w:spacing w:after="0"/>
+            </w:pPr>
             <w:r>
               <w:rPr>
                 <w:color w:val="201E19"/>
@@ -1041,13 +1203,16 @@
             <w:tcW w:type="dxa" w:w="2400"/>
             <w:shd w:val="clear" w:color="auto" w:fill="FFFFFF"/>
             <w:tcMar>
-              <w:top w:w="100" w:type="dxa"/>
-              <w:bottom w:w="100" w:type="dxa"/>
-              <w:start w:w="140" w:type="dxa"/>
-              <w:end w:w="140" w:type="dxa"/>
+              <w:top w:w="60" w:type="dxa"/>
+              <w:bottom w:w="60" w:type="dxa"/>
+              <w:start w:w="120" w:type="dxa"/>
+              <w:end w:w="120" w:type="dxa"/>
             </w:tcMar>
           </w:tcPr>
           <w:p>
+            <w:pPr>
+              <w:spacing w:after="0"/>
+            </w:pPr>
             <w:r>
               <w:rPr>
                 <w:color w:val="201E19"/>
@@ -1063,13 +1228,16 @@
             <w:tcW w:type="dxa" w:w="4300"/>
             <w:shd w:val="clear" w:color="auto" w:fill="FFFFFF"/>
             <w:tcMar>
-              <w:top w:w="100" w:type="dxa"/>
-              <w:bottom w:w="100" w:type="dxa"/>
-              <w:start w:w="140" w:type="dxa"/>
-              <w:end w:w="140" w:type="dxa"/>
+              <w:top w:w="60" w:type="dxa"/>
+              <w:bottom w:w="60" w:type="dxa"/>
+              <w:start w:w="120" w:type="dxa"/>
+              <w:end w:w="120" w:type="dxa"/>
             </w:tcMar>
           </w:tcPr>
           <w:p>
+            <w:pPr>
+              <w:spacing w:after="0"/>
+            </w:pPr>
             <w:r>
               <w:rPr>
                 <w:color w:val="201E19"/>
@@ -1085,19 +1253,22 @@
             <w:tcW w:type="dxa" w:w="3272"/>
             <w:shd w:val="clear" w:color="auto" w:fill="FFFFFF"/>
             <w:tcMar>
-              <w:top w:w="100" w:type="dxa"/>
-              <w:bottom w:w="100" w:type="dxa"/>
-              <w:start w:w="140" w:type="dxa"/>
-              <w:end w:w="140" w:type="dxa"/>
+              <w:top w:w="60" w:type="dxa"/>
+              <w:bottom w:w="60" w:type="dxa"/>
+              <w:start w:w="120" w:type="dxa"/>
+              <w:end w:w="120" w:type="dxa"/>
             </w:tcMar>
           </w:tcPr>
           <w:p>
+            <w:pPr>
+              <w:spacing w:after="0"/>
+            </w:pPr>
             <w:r>
               <w:rPr>
                 <w:color w:val="201E19"/>
                 <w:sz w:val="19"/>
               </w:rPr>
-              <w:t>Non-commercial research licence; the model may not be redistributed</w:t>
+              <w:t>Non-commercial use only; the model may not be redistributed</w:t>
             </w:r>
           </w:p>
         </w:tc>
@@ -1109,13 +1280,16 @@
             <w:tcW w:type="dxa" w:w="2400"/>
             <w:shd w:val="clear" w:color="auto" w:fill="FFFFFF"/>
             <w:tcMar>
-              <w:top w:w="100" w:type="dxa"/>
-              <w:bottom w:w="100" w:type="dxa"/>
-              <w:start w:w="140" w:type="dxa"/>
-              <w:end w:w="140" w:type="dxa"/>
+              <w:top w:w="60" w:type="dxa"/>
+              <w:bottom w:w="60" w:type="dxa"/>
+              <w:start w:w="120" w:type="dxa"/>
+              <w:end w:w="120" w:type="dxa"/>
             </w:tcMar>
           </w:tcPr>
           <w:p>
+            <w:pPr>
+              <w:spacing w:after="0"/>
+            </w:pPr>
             <w:r>
               <w:rPr>
                 <w:color w:val="201E19"/>
@@ -1131,13 +1305,16 @@
             <w:tcW w:type="dxa" w:w="4300"/>
             <w:shd w:val="clear" w:color="auto" w:fill="FFFFFF"/>
             <w:tcMar>
-              <w:top w:w="100" w:type="dxa"/>
-              <w:bottom w:w="100" w:type="dxa"/>
-              <w:start w:w="140" w:type="dxa"/>
-              <w:end w:w="140" w:type="dxa"/>
+              <w:top w:w="60" w:type="dxa"/>
+              <w:bottom w:w="60" w:type="dxa"/>
+              <w:start w:w="120" w:type="dxa"/>
+              <w:end w:w="120" w:type="dxa"/>
             </w:tcMar>
           </w:tcPr>
           <w:p>
+            <w:pPr>
+              <w:spacing w:after="0"/>
+            </w:pPr>
             <w:r>
               <w:rPr>
                 <w:color w:val="201E19"/>
@@ -1153,13 +1330,16 @@
             <w:tcW w:type="dxa" w:w="3272"/>
             <w:shd w:val="clear" w:color="auto" w:fill="FFFFFF"/>
             <w:tcMar>
-              <w:top w:w="100" w:type="dxa"/>
-              <w:bottom w:w="100" w:type="dxa"/>
-              <w:start w:w="140" w:type="dxa"/>
-              <w:end w:w="140" w:type="dxa"/>
+              <w:top w:w="60" w:type="dxa"/>
+              <w:bottom w:w="60" w:type="dxa"/>
+              <w:start w:w="120" w:type="dxa"/>
+              <w:end w:w="120" w:type="dxa"/>
             </w:tcMar>
           </w:tcPr>
           <w:p>
+            <w:pPr>
+              <w:spacing w:after="0"/>
+            </w:pPr>
             <w:r>
               <w:rPr>
                 <w:color w:val="201E19"/>
@@ -1177,13 +1357,16 @@
             <w:tcW w:type="dxa" w:w="2400"/>
             <w:shd w:val="clear" w:color="auto" w:fill="FFFFFF"/>
             <w:tcMar>
-              <w:top w:w="100" w:type="dxa"/>
-              <w:bottom w:w="100" w:type="dxa"/>
-              <w:start w:w="140" w:type="dxa"/>
-              <w:end w:w="140" w:type="dxa"/>
+              <w:top w:w="60" w:type="dxa"/>
+              <w:bottom w:w="60" w:type="dxa"/>
+              <w:start w:w="120" w:type="dxa"/>
+              <w:end w:w="120" w:type="dxa"/>
             </w:tcMar>
           </w:tcPr>
           <w:p>
+            <w:pPr>
+              <w:spacing w:after="0"/>
+            </w:pPr>
             <w:r>
               <w:rPr>
                 <w:color w:val="201E19"/>
@@ -1199,13 +1382,16 @@
             <w:tcW w:type="dxa" w:w="4300"/>
             <w:shd w:val="clear" w:color="auto" w:fill="FFFFFF"/>
             <w:tcMar>
-              <w:top w:w="100" w:type="dxa"/>
-              <w:bottom w:w="100" w:type="dxa"/>
-              <w:start w:w="140" w:type="dxa"/>
-              <w:end w:w="140" w:type="dxa"/>
+              <w:top w:w="60" w:type="dxa"/>
+              <w:bottom w:w="60" w:type="dxa"/>
+              <w:start w:w="120" w:type="dxa"/>
+              <w:end w:w="120" w:type="dxa"/>
             </w:tcMar>
           </w:tcPr>
           <w:p>
+            <w:pPr>
+              <w:spacing w:after="0"/>
+            </w:pPr>
             <w:r>
               <w:rPr>
                 <w:color w:val="201E19"/>
@@ -1221,13 +1407,16 @@
             <w:tcW w:type="dxa" w:w="3272"/>
             <w:shd w:val="clear" w:color="auto" w:fill="FFFFFF"/>
             <w:tcMar>
-              <w:top w:w="100" w:type="dxa"/>
-              <w:bottom w:w="100" w:type="dxa"/>
-              <w:start w:w="140" w:type="dxa"/>
-              <w:end w:w="140" w:type="dxa"/>
+              <w:top w:w="60" w:type="dxa"/>
+              <w:bottom w:w="60" w:type="dxa"/>
+              <w:start w:w="120" w:type="dxa"/>
+              <w:end w:w="120" w:type="dxa"/>
             </w:tcMar>
           </w:tcPr>
           <w:p>
+            <w:pPr>
+              <w:spacing w:after="0"/>
+            </w:pPr>
             <w:r>
               <w:rPr>
                 <w:color w:val="201E19"/>
@@ -1245,13 +1434,16 @@
             <w:tcW w:type="dxa" w:w="2400"/>
             <w:shd w:val="clear" w:color="auto" w:fill="FFFFFF"/>
             <w:tcMar>
-              <w:top w:w="100" w:type="dxa"/>
-              <w:bottom w:w="100" w:type="dxa"/>
-              <w:start w:w="140" w:type="dxa"/>
-              <w:end w:w="140" w:type="dxa"/>
+              <w:top w:w="60" w:type="dxa"/>
+              <w:bottom w:w="60" w:type="dxa"/>
+              <w:start w:w="120" w:type="dxa"/>
+              <w:end w:w="120" w:type="dxa"/>
             </w:tcMar>
           </w:tcPr>
           <w:p>
+            <w:pPr>
+              <w:spacing w:after="0"/>
+            </w:pPr>
             <w:r>
               <w:rPr>
                 <w:color w:val="201E19"/>
@@ -1267,13 +1459,16 @@
             <w:tcW w:type="dxa" w:w="4300"/>
             <w:shd w:val="clear" w:color="auto" w:fill="FFFFFF"/>
             <w:tcMar>
-              <w:top w:w="100" w:type="dxa"/>
-              <w:bottom w:w="100" w:type="dxa"/>
-              <w:start w:w="140" w:type="dxa"/>
-              <w:end w:w="140" w:type="dxa"/>
+              <w:top w:w="60" w:type="dxa"/>
+              <w:bottom w:w="60" w:type="dxa"/>
+              <w:start w:w="120" w:type="dxa"/>
+              <w:end w:w="120" w:type="dxa"/>
             </w:tcMar>
           </w:tcPr>
           <w:p>
+            <w:pPr>
+              <w:spacing w:after="0"/>
+            </w:pPr>
             <w:r>
               <w:rPr>
                 <w:color w:val="201E19"/>
@@ -1289,13 +1484,16 @@
             <w:tcW w:type="dxa" w:w="3272"/>
             <w:shd w:val="clear" w:color="auto" w:fill="FFFFFF"/>
             <w:tcMar>
-              <w:top w:w="100" w:type="dxa"/>
-              <w:bottom w:w="100" w:type="dxa"/>
-              <w:start w:w="140" w:type="dxa"/>
-              <w:end w:w="140" w:type="dxa"/>
+              <w:top w:w="60" w:type="dxa"/>
+              <w:bottom w:w="60" w:type="dxa"/>
+              <w:start w:w="120" w:type="dxa"/>
+              <w:end w:w="120" w:type="dxa"/>
             </w:tcMar>
           </w:tcPr>
           <w:p>
+            <w:pPr>
+              <w:spacing w:after="0"/>
+            </w:pPr>
             <w:r>
               <w:rPr>
                 <w:color w:val="201E19"/>
@@ -1313,13 +1511,16 @@
             <w:tcW w:type="dxa" w:w="2400"/>
             <w:shd w:val="clear" w:color="auto" w:fill="FFFFFF"/>
             <w:tcMar>
-              <w:top w:w="100" w:type="dxa"/>
-              <w:bottom w:w="100" w:type="dxa"/>
-              <w:start w:w="140" w:type="dxa"/>
-              <w:end w:w="140" w:type="dxa"/>
+              <w:top w:w="60" w:type="dxa"/>
+              <w:bottom w:w="60" w:type="dxa"/>
+              <w:start w:w="120" w:type="dxa"/>
+              <w:end w:w="120" w:type="dxa"/>
             </w:tcMar>
           </w:tcPr>
           <w:p>
+            <w:pPr>
+              <w:spacing w:after="0"/>
+            </w:pPr>
             <w:r>
               <w:rPr>
                 <w:color w:val="201E19"/>
@@ -1335,13 +1536,16 @@
             <w:tcW w:type="dxa" w:w="4300"/>
             <w:shd w:val="clear" w:color="auto" w:fill="FFFFFF"/>
             <w:tcMar>
-              <w:top w:w="100" w:type="dxa"/>
-              <w:bottom w:w="100" w:type="dxa"/>
-              <w:start w:w="140" w:type="dxa"/>
-              <w:end w:w="140" w:type="dxa"/>
+              <w:top w:w="60" w:type="dxa"/>
+              <w:bottom w:w="60" w:type="dxa"/>
+              <w:start w:w="120" w:type="dxa"/>
+              <w:end w:w="120" w:type="dxa"/>
             </w:tcMar>
           </w:tcPr>
           <w:p>
+            <w:pPr>
+              <w:spacing w:after="0"/>
+            </w:pPr>
             <w:r>
               <w:rPr>
                 <w:color w:val="201E19"/>
@@ -1357,19 +1561,22 @@
             <w:tcW w:type="dxa" w:w="3272"/>
             <w:shd w:val="clear" w:color="auto" w:fill="FFFFFF"/>
             <w:tcMar>
-              <w:top w:w="100" w:type="dxa"/>
-              <w:bottom w:w="100" w:type="dxa"/>
-              <w:start w:w="140" w:type="dxa"/>
-              <w:end w:w="140" w:type="dxa"/>
+              <w:top w:w="60" w:type="dxa"/>
+              <w:bottom w:w="60" w:type="dxa"/>
+              <w:start w:w="120" w:type="dxa"/>
+              <w:end w:w="120" w:type="dxa"/>
             </w:tcMar>
           </w:tcPr>
           <w:p>
+            <w:pPr>
+              <w:spacing w:after="0"/>
+            </w:pPr>
             <w:r>
               <w:rPr>
                 <w:color w:val="201E19"/>
                 <w:sz w:val="19"/>
               </w:rPr>
-              <w:t>Not yet confirmed</w:t>
+              <w:t>CC BY-NC 4.0 -- non-commercial use only</w:t>
             </w:r>
           </w:p>
         </w:tc>
@@ -1381,13 +1588,16 @@
             <w:tcW w:type="dxa" w:w="2400"/>
             <w:shd w:val="clear" w:color="auto" w:fill="FFFFFF"/>
             <w:tcMar>
-              <w:top w:w="100" w:type="dxa"/>
-              <w:bottom w:w="100" w:type="dxa"/>
-              <w:start w:w="140" w:type="dxa"/>
-              <w:end w:w="140" w:type="dxa"/>
+              <w:top w:w="60" w:type="dxa"/>
+              <w:bottom w:w="60" w:type="dxa"/>
+              <w:start w:w="120" w:type="dxa"/>
+              <w:end w:w="120" w:type="dxa"/>
             </w:tcMar>
           </w:tcPr>
           <w:p>
+            <w:pPr>
+              <w:spacing w:after="0"/>
+            </w:pPr>
             <w:r>
               <w:rPr>
                 <w:color w:val="201E19"/>
@@ -1403,13 +1613,16 @@
             <w:tcW w:type="dxa" w:w="4300"/>
             <w:shd w:val="clear" w:color="auto" w:fill="FFFFFF"/>
             <w:tcMar>
-              <w:top w:w="100" w:type="dxa"/>
-              <w:bottom w:w="100" w:type="dxa"/>
-              <w:start w:w="140" w:type="dxa"/>
-              <w:end w:w="140" w:type="dxa"/>
+              <w:top w:w="60" w:type="dxa"/>
+              <w:bottom w:w="60" w:type="dxa"/>
+              <w:start w:w="120" w:type="dxa"/>
+              <w:end w:w="120" w:type="dxa"/>
             </w:tcMar>
           </w:tcPr>
           <w:p>
+            <w:pPr>
+              <w:spacing w:after="0"/>
+            </w:pPr>
             <w:r>
               <w:rPr>
                 <w:color w:val="201E19"/>
@@ -1425,13 +1638,16 @@
             <w:tcW w:type="dxa" w:w="3272"/>
             <w:shd w:val="clear" w:color="auto" w:fill="FFFFFF"/>
             <w:tcMar>
-              <w:top w:w="100" w:type="dxa"/>
-              <w:bottom w:w="100" w:type="dxa"/>
-              <w:start w:w="140" w:type="dxa"/>
-              <w:end w:w="140" w:type="dxa"/>
+              <w:top w:w="60" w:type="dxa"/>
+              <w:bottom w:w="60" w:type="dxa"/>
+              <w:start w:w="120" w:type="dxa"/>
+              <w:end w:w="120" w:type="dxa"/>
             </w:tcMar>
           </w:tcPr>
           <w:p>
+            <w:pPr>
+              <w:spacing w:after="0"/>
+            </w:pPr>
             <w:r>
               <w:rPr>
                 <w:color w:val="201E19"/>
@@ -1449,13 +1665,16 @@
             <w:tcW w:type="dxa" w:w="2400"/>
             <w:shd w:val="clear" w:color="auto" w:fill="FFFFFF"/>
             <w:tcMar>
-              <w:top w:w="100" w:type="dxa"/>
-              <w:bottom w:w="100" w:type="dxa"/>
-              <w:start w:w="140" w:type="dxa"/>
-              <w:end w:w="140" w:type="dxa"/>
+              <w:top w:w="60" w:type="dxa"/>
+              <w:bottom w:w="60" w:type="dxa"/>
+              <w:start w:w="120" w:type="dxa"/>
+              <w:end w:w="120" w:type="dxa"/>
             </w:tcMar>
           </w:tcPr>
           <w:p>
+            <w:pPr>
+              <w:spacing w:after="0"/>
+            </w:pPr>
             <w:r>
               <w:rPr>
                 <w:color w:val="201E19"/>
@@ -1471,13 +1690,16 @@
             <w:tcW w:type="dxa" w:w="4300"/>
             <w:shd w:val="clear" w:color="auto" w:fill="FFFFFF"/>
             <w:tcMar>
-              <w:top w:w="100" w:type="dxa"/>
-              <w:bottom w:w="100" w:type="dxa"/>
-              <w:start w:w="140" w:type="dxa"/>
-              <w:end w:w="140" w:type="dxa"/>
+              <w:top w:w="60" w:type="dxa"/>
+              <w:bottom w:w="60" w:type="dxa"/>
+              <w:start w:w="120" w:type="dxa"/>
+              <w:end w:w="120" w:type="dxa"/>
             </w:tcMar>
           </w:tcPr>
           <w:p>
+            <w:pPr>
+              <w:spacing w:after="0"/>
+            </w:pPr>
             <w:r>
               <w:rPr>
                 <w:color w:val="201E19"/>
@@ -1493,13 +1715,16 @@
             <w:tcW w:type="dxa" w:w="3272"/>
             <w:shd w:val="clear" w:color="auto" w:fill="FFFFFF"/>
             <w:tcMar>
-              <w:top w:w="100" w:type="dxa"/>
-              <w:bottom w:w="100" w:type="dxa"/>
-              <w:start w:w="140" w:type="dxa"/>
-              <w:end w:w="140" w:type="dxa"/>
+              <w:top w:w="60" w:type="dxa"/>
+              <w:bottom w:w="60" w:type="dxa"/>
+              <w:start w:w="120" w:type="dxa"/>
+              <w:end w:w="120" w:type="dxa"/>
             </w:tcMar>
           </w:tcPr>
           <w:p>
+            <w:pPr>
+              <w:spacing w:after="0"/>
+            </w:pPr>
             <w:r>
               <w:rPr>
                 <w:color w:val="201E19"/>
@@ -1517,13 +1742,16 @@
             <w:tcW w:type="dxa" w:w="2400"/>
             <w:shd w:val="clear" w:color="auto" w:fill="FFFFFF"/>
             <w:tcMar>
-              <w:top w:w="100" w:type="dxa"/>
-              <w:bottom w:w="100" w:type="dxa"/>
-              <w:start w:w="140" w:type="dxa"/>
-              <w:end w:w="140" w:type="dxa"/>
+              <w:top w:w="60" w:type="dxa"/>
+              <w:bottom w:w="60" w:type="dxa"/>
+              <w:start w:w="120" w:type="dxa"/>
+              <w:end w:w="120" w:type="dxa"/>
             </w:tcMar>
           </w:tcPr>
           <w:p>
+            <w:pPr>
+              <w:spacing w:after="0"/>
+            </w:pPr>
             <w:r>
               <w:rPr>
                 <w:color w:val="201E19"/>
@@ -1539,13 +1767,16 @@
             <w:tcW w:type="dxa" w:w="4300"/>
             <w:shd w:val="clear" w:color="auto" w:fill="FFFFFF"/>
             <w:tcMar>
-              <w:top w:w="100" w:type="dxa"/>
-              <w:bottom w:w="100" w:type="dxa"/>
-              <w:start w:w="140" w:type="dxa"/>
-              <w:end w:w="140" w:type="dxa"/>
+              <w:top w:w="60" w:type="dxa"/>
+              <w:bottom w:w="60" w:type="dxa"/>
+              <w:start w:w="120" w:type="dxa"/>
+              <w:end w:w="120" w:type="dxa"/>
             </w:tcMar>
           </w:tcPr>
           <w:p>
+            <w:pPr>
+              <w:spacing w:after="0"/>
+            </w:pPr>
             <w:r>
               <w:rPr>
                 <w:color w:val="201E19"/>
@@ -1561,13 +1792,16 @@
             <w:tcW w:type="dxa" w:w="3272"/>
             <w:shd w:val="clear" w:color="auto" w:fill="FFFFFF"/>
             <w:tcMar>
-              <w:top w:w="100" w:type="dxa"/>
-              <w:bottom w:w="100" w:type="dxa"/>
-              <w:start w:w="140" w:type="dxa"/>
-              <w:end w:w="140" w:type="dxa"/>
+              <w:top w:w="60" w:type="dxa"/>
+              <w:bottom w:w="60" w:type="dxa"/>
+              <w:start w:w="120" w:type="dxa"/>
+              <w:end w:w="120" w:type="dxa"/>
             </w:tcMar>
           </w:tcPr>
           <w:p>
+            <w:pPr>
+              <w:spacing w:after="0"/>
+            </w:pPr>
             <w:r>
               <w:rPr>
                 <w:color w:val="201E19"/>
@@ -1584,62 +1818,22 @@
         <w:spacing w:after="80"/>
       </w:pPr>
     </w:p>
-    <w:tbl>
-      <w:tblPr>
-        <w:tblW w:type="auto" w:w="0"/>
-        <w:tblLook w:firstColumn="1" w:firstRow="1" w:lastColumn="0" w:lastRow="0" w:noHBand="0" w:noVBand="1" w:val="04A0"/>
-        <w:tblBorders>
-          <w:top w:val="single" w:sz="4" w:space="0" w:color="E3B8B8"/>
-          <w:left w:val="single" w:sz="4" w:space="0" w:color="E3B8B8"/>
-          <w:bottom w:val="single" w:sz="4" w:space="0" w:color="E3B8B8"/>
-          <w:right w:val="single" w:sz="4" w:space="0" w:color="E3B8B8"/>
-          <w:insideH w:val="single" w:sz="4" w:space="0" w:color="E3B8B8"/>
-          <w:insideV w:val="single" w:sz="4" w:space="0" w:color="E3B8B8"/>
-        </w:tblBorders>
-      </w:tblPr>
-      <w:tblGrid>
-        <w:gridCol w:w="9972"/>
-      </w:tblGrid>
-      <w:tr>
-        <w:tc>
-          <w:tcPr>
-            <w:tcW w:type="dxa" w:w="9972"/>
-            <w:tcW w:type="dxa" w:w="9972"/>
-            <w:shd w:val="clear" w:color="auto" w:fill="FBEFEF"/>
-            <w:tcMar>
-              <w:top w:w="80" w:type="dxa"/>
-              <w:bottom w:w="80" w:type="dxa"/>
-              <w:start w:w="140" w:type="dxa"/>
-              <w:end w:w="140" w:type="dxa"/>
-            </w:tcMar>
-          </w:tcPr>
-          <w:p>
-            <w:r>
-              <w:rPr>
-                <w:b/>
-                <w:color w:val="9C2F2F"/>
-                <w:sz w:val="19"/>
-              </w:rPr>
-              <w:t xml:space="preserve">TEAM TO COMPLETE: </w:t>
-            </w:r>
-            <w:r>
-              <w:rPr>
-                <w:color w:val="9C2F2F"/>
-                <w:sz w:val="19"/>
-              </w:rPr>
-              <w:t>several assets above are licensed for non-commercial use only (SMPL-X, the BEDLAM skin texture, Auslan Signbank, the research datasets). Confirm the terms of each against how a sponsor intends to use the product before any commercial use, and confirm whether the Avaturn hair may be used on a public website.</w:t>
-            </w:r>
-          </w:p>
-        </w:tc>
-      </w:tr>
-    </w:tbl>
     <w:p>
       <w:pPr>
-        <w:spacing w:after="80"/>
+        <w:spacing w:after="160"/>
       </w:pPr>
+      <w:r>
+        <w:rPr>
+          <w:i w:val="0"/>
+          <w:color w:val="201E19"/>
+          <w:sz w:val="21"/>
+        </w:rPr>
+        <w:t>Licence position: the restricted assets above -- Auslan Signbank, the research datasets and everything derived from them, SMPL-X, the BEDLAM skin and the avatar hair -- are licensed under Creative Commons 4.0 non-commercial terms (CC BY-NC 4.0; CC BY-NC-ND 4.0 for Signbank) or an equivalent non-commercial research licence. HandMirror may therefore be run free of charge, as it is today, for non-commercial use only. Any commercial use requires a separate licence from each rights holder first.</w:t>
+      </w:r>
     </w:p>
     <w:p>
       <w:pPr>
+        <w:keepNext/>
         <w:spacing w:before="160" w:after="80"/>
       </w:pPr>
       <w:r>
@@ -1666,6 +1860,7 @@
     </w:p>
     <w:p>
       <w:pPr>
+        <w:keepNext/>
         <w:spacing w:before="160" w:after="80"/>
       </w:pPr>
       <w:r>
@@ -1687,7 +1882,7 @@
           <w:color w:val="201E19"/>
           <w:sz w:val="21"/>
         </w:rPr>
-        <w:t>No user accounts. Learned and To Learn lists are stored only in the visitor's own browser (localStorage) and are never sent to the server.</w:t>
+        <w:t>No user accounts. Learnt and To Learn lists are stored only in the visitor's own browser (localStorage) and are never sent to the server.</w:t>
       </w:r>
     </w:p>
     <w:p>
@@ -1791,11 +1986,12 @@
           <w:color w:val="201E19"/>
           <w:sz w:val="21"/>
         </w:rPr>
-        <w:t>Recommendation: tell users on the Sign Chat page that their messages are processed by the service and not kept beyond the session.</w:t>
+        <w:t>Personal information is handled in line with the Australian Privacy Principles (Privacy Act 1988, Cth): nothing is collected that the feature does not need, camera video is not stored, and no learner is identified. The mapping to each principle is in the Support Document, Section 7. Recommendation: tell users on the Sign Chat page that their messages are processed by the service and not kept beyond the session.</w:t>
       </w:r>
     </w:p>
     <w:p>
       <w:pPr>
+        <w:keepNext/>
         <w:spacing w:before="160" w:after="80"/>
       </w:pPr>
       <w:r>
@@ -1822,6 +2018,7 @@
     </w:p>
     <w:p>
       <w:pPr>
+        <w:keepNext/>
         <w:spacing w:before="160" w:after="80"/>
       </w:pPr>
       <w:r>
@@ -1858,13 +2055,16 @@
             <w:tcW w:type="dxa" w:w="2400"/>
             <w:shd w:val="clear" w:color="auto" w:fill="1F3D7A"/>
             <w:tcMar>
-              <w:top w:w="100" w:type="dxa"/>
-              <w:bottom w:w="100" w:type="dxa"/>
-              <w:start w:w="140" w:type="dxa"/>
-              <w:end w:w="140" w:type="dxa"/>
+              <w:top w:w="60" w:type="dxa"/>
+              <w:bottom w:w="60" w:type="dxa"/>
+              <w:start w:w="120" w:type="dxa"/>
+              <w:end w:w="120" w:type="dxa"/>
             </w:tcMar>
           </w:tcPr>
           <w:p>
+            <w:pPr>
+              <w:spacing w:after="0"/>
+            </w:pPr>
             <w:r>
               <w:rPr>
                 <w:b/>
@@ -1881,13 +2081,16 @@
             <w:tcW w:type="dxa" w:w="7572"/>
             <w:shd w:val="clear" w:color="auto" w:fill="1F3D7A"/>
             <w:tcMar>
-              <w:top w:w="100" w:type="dxa"/>
-              <w:bottom w:w="100" w:type="dxa"/>
-              <w:start w:w="140" w:type="dxa"/>
-              <w:end w:w="140" w:type="dxa"/>
+              <w:top w:w="60" w:type="dxa"/>
+              <w:bottom w:w="60" w:type="dxa"/>
+              <w:start w:w="120" w:type="dxa"/>
+              <w:end w:w="120" w:type="dxa"/>
             </w:tcMar>
           </w:tcPr>
           <w:p>
+            <w:pPr>
+              <w:spacing w:after="0"/>
+            </w:pPr>
             <w:r>
               <w:rPr>
                 <w:b/>
@@ -1906,13 +2109,16 @@
             <w:tcW w:type="dxa" w:w="2400"/>
             <w:shd w:val="clear" w:color="auto" w:fill="FFFFFF"/>
             <w:tcMar>
-              <w:top w:w="100" w:type="dxa"/>
-              <w:bottom w:w="100" w:type="dxa"/>
-              <w:start w:w="140" w:type="dxa"/>
-              <w:end w:w="140" w:type="dxa"/>
+              <w:top w:w="60" w:type="dxa"/>
+              <w:bottom w:w="60" w:type="dxa"/>
+              <w:start w:w="120" w:type="dxa"/>
+              <w:end w:w="120" w:type="dxa"/>
             </w:tcMar>
           </w:tcPr>
           <w:p>
+            <w:pPr>
+              <w:spacing w:after="0"/>
+            </w:pPr>
             <w:r>
               <w:rPr>
                 <w:color w:val="201E19"/>
@@ -1928,13 +2134,16 @@
             <w:tcW w:type="dxa" w:w="7572"/>
             <w:shd w:val="clear" w:color="auto" w:fill="FFFFFF"/>
             <w:tcMar>
-              <w:top w:w="100" w:type="dxa"/>
-              <w:bottom w:w="100" w:type="dxa"/>
-              <w:start w:w="140" w:type="dxa"/>
-              <w:end w:w="140" w:type="dxa"/>
+              <w:top w:w="60" w:type="dxa"/>
+              <w:bottom w:w="60" w:type="dxa"/>
+              <w:start w:w="120" w:type="dxa"/>
+              <w:end w:w="120" w:type="dxa"/>
             </w:tcMar>
           </w:tcPr>
           <w:p>
+            <w:pPr>
+              <w:spacing w:after="0"/>
+            </w:pPr>
             <w:r>
               <w:rPr>
                 <w:color w:val="201E19"/>
@@ -1952,13 +2161,16 @@
             <w:tcW w:type="dxa" w:w="2400"/>
             <w:shd w:val="clear" w:color="auto" w:fill="FFFFFF"/>
             <w:tcMar>
-              <w:top w:w="100" w:type="dxa"/>
-              <w:bottom w:w="100" w:type="dxa"/>
-              <w:start w:w="140" w:type="dxa"/>
-              <w:end w:w="140" w:type="dxa"/>
+              <w:top w:w="60" w:type="dxa"/>
+              <w:bottom w:w="60" w:type="dxa"/>
+              <w:start w:w="120" w:type="dxa"/>
+              <w:end w:w="120" w:type="dxa"/>
             </w:tcMar>
           </w:tcPr>
           <w:p>
+            <w:pPr>
+              <w:spacing w:after="0"/>
+            </w:pPr>
             <w:r>
               <w:rPr>
                 <w:color w:val="201E19"/>
@@ -1974,13 +2186,16 @@
             <w:tcW w:type="dxa" w:w="7572"/>
             <w:shd w:val="clear" w:color="auto" w:fill="FFFFFF"/>
             <w:tcMar>
-              <w:top w:w="100" w:type="dxa"/>
-              <w:bottom w:w="100" w:type="dxa"/>
-              <w:start w:w="140" w:type="dxa"/>
-              <w:end w:w="140" w:type="dxa"/>
+              <w:top w:w="60" w:type="dxa"/>
+              <w:bottom w:w="60" w:type="dxa"/>
+              <w:start w:w="120" w:type="dxa"/>
+              <w:end w:w="120" w:type="dxa"/>
             </w:tcMar>
           </w:tcPr>
           <w:p>
+            <w:pPr>
+              <w:spacing w:after="0"/>
+            </w:pPr>
             <w:r>
               <w:rPr>
                 <w:color w:val="201E19"/>
@@ -1998,13 +2213,16 @@
             <w:tcW w:type="dxa" w:w="2400"/>
             <w:shd w:val="clear" w:color="auto" w:fill="FFFFFF"/>
             <w:tcMar>
-              <w:top w:w="100" w:type="dxa"/>
-              <w:bottom w:w="100" w:type="dxa"/>
-              <w:start w:w="140" w:type="dxa"/>
-              <w:end w:w="140" w:type="dxa"/>
+              <w:top w:w="60" w:type="dxa"/>
+              <w:bottom w:w="60" w:type="dxa"/>
+              <w:start w:w="120" w:type="dxa"/>
+              <w:end w:w="120" w:type="dxa"/>
             </w:tcMar>
           </w:tcPr>
           <w:p>
+            <w:pPr>
+              <w:spacing w:after="0"/>
+            </w:pPr>
             <w:r>
               <w:rPr>
                 <w:color w:val="201E19"/>
@@ -2020,13 +2238,16 @@
             <w:tcW w:type="dxa" w:w="7572"/>
             <w:shd w:val="clear" w:color="auto" w:fill="FFFFFF"/>
             <w:tcMar>
-              <w:top w:w="100" w:type="dxa"/>
-              <w:bottom w:w="100" w:type="dxa"/>
-              <w:start w:w="140" w:type="dxa"/>
-              <w:end w:w="140" w:type="dxa"/>
+              <w:top w:w="60" w:type="dxa"/>
+              <w:bottom w:w="60" w:type="dxa"/>
+              <w:start w:w="120" w:type="dxa"/>
+              <w:end w:w="120" w:type="dxa"/>
             </w:tcMar>
           </w:tcPr>
           <w:p>
+            <w:pPr>
+              <w:spacing w:after="0"/>
+            </w:pPr>
             <w:r>
               <w:rPr>
                 <w:color w:val="201E19"/>
@@ -2044,13 +2265,16 @@
             <w:tcW w:type="dxa" w:w="2400"/>
             <w:shd w:val="clear" w:color="auto" w:fill="FFFFFF"/>
             <w:tcMar>
-              <w:top w:w="100" w:type="dxa"/>
-              <w:bottom w:w="100" w:type="dxa"/>
-              <w:start w:w="140" w:type="dxa"/>
-              <w:end w:w="140" w:type="dxa"/>
+              <w:top w:w="60" w:type="dxa"/>
+              <w:bottom w:w="60" w:type="dxa"/>
+              <w:start w:w="120" w:type="dxa"/>
+              <w:end w:w="120" w:type="dxa"/>
             </w:tcMar>
           </w:tcPr>
           <w:p>
+            <w:pPr>
+              <w:spacing w:after="0"/>
+            </w:pPr>
             <w:r>
               <w:rPr>
                 <w:color w:val="201E19"/>
@@ -2066,13 +2290,16 @@
             <w:tcW w:type="dxa" w:w="7572"/>
             <w:shd w:val="clear" w:color="auto" w:fill="FFFFFF"/>
             <w:tcMar>
-              <w:top w:w="100" w:type="dxa"/>
-              <w:bottom w:w="100" w:type="dxa"/>
-              <w:start w:w="140" w:type="dxa"/>
-              <w:end w:w="140" w:type="dxa"/>
+              <w:top w:w="60" w:type="dxa"/>
+              <w:bottom w:w="60" w:type="dxa"/>
+              <w:start w:w="120" w:type="dxa"/>
+              <w:end w:w="120" w:type="dxa"/>
             </w:tcMar>
           </w:tcPr>
           <w:p>
+            <w:pPr>
+              <w:spacing w:after="0"/>
+            </w:pPr>
             <w:r>
               <w:rPr>
                 <w:color w:val="201E19"/>
@@ -2090,13 +2317,16 @@
             <w:tcW w:type="dxa" w:w="2400"/>
             <w:shd w:val="clear" w:color="auto" w:fill="FFFFFF"/>
             <w:tcMar>
-              <w:top w:w="100" w:type="dxa"/>
-              <w:bottom w:w="100" w:type="dxa"/>
-              <w:start w:w="140" w:type="dxa"/>
-              <w:end w:w="140" w:type="dxa"/>
+              <w:top w:w="60" w:type="dxa"/>
+              <w:bottom w:w="60" w:type="dxa"/>
+              <w:start w:w="120" w:type="dxa"/>
+              <w:end w:w="120" w:type="dxa"/>
             </w:tcMar>
           </w:tcPr>
           <w:p>
+            <w:pPr>
+              <w:spacing w:after="0"/>
+            </w:pPr>
             <w:r>
               <w:rPr>
                 <w:color w:val="201E19"/>
@@ -2112,13 +2342,16 @@
             <w:tcW w:type="dxa" w:w="7572"/>
             <w:shd w:val="clear" w:color="auto" w:fill="FFFFFF"/>
             <w:tcMar>
-              <w:top w:w="100" w:type="dxa"/>
-              <w:bottom w:w="100" w:type="dxa"/>
-              <w:start w:w="140" w:type="dxa"/>
-              <w:end w:w="140" w:type="dxa"/>
+              <w:top w:w="60" w:type="dxa"/>
+              <w:bottom w:w="60" w:type="dxa"/>
+              <w:start w:w="120" w:type="dxa"/>
+              <w:end w:w="120" w:type="dxa"/>
             </w:tcMar>
           </w:tcPr>
           <w:p>
+            <w:pPr>
+              <w:spacing w:after="0"/>
+            </w:pPr>
             <w:r>
               <w:rPr>
                 <w:color w:val="201E19"/>
@@ -2136,13 +2369,16 @@
             <w:tcW w:type="dxa" w:w="2400"/>
             <w:shd w:val="clear" w:color="auto" w:fill="FFFFFF"/>
             <w:tcMar>
-              <w:top w:w="100" w:type="dxa"/>
-              <w:bottom w:w="100" w:type="dxa"/>
-              <w:start w:w="140" w:type="dxa"/>
-              <w:end w:w="140" w:type="dxa"/>
+              <w:top w:w="60" w:type="dxa"/>
+              <w:bottom w:w="60" w:type="dxa"/>
+              <w:start w:w="120" w:type="dxa"/>
+              <w:end w:w="120" w:type="dxa"/>
             </w:tcMar>
           </w:tcPr>
           <w:p>
+            <w:pPr>
+              <w:spacing w:after="0"/>
+            </w:pPr>
             <w:r>
               <w:rPr>
                 <w:color w:val="201E19"/>
@@ -2158,19 +2394,22 @@
             <w:tcW w:type="dxa" w:w="7572"/>
             <w:shd w:val="clear" w:color="auto" w:fill="FFFFFF"/>
             <w:tcMar>
-              <w:top w:w="100" w:type="dxa"/>
-              <w:bottom w:w="100" w:type="dxa"/>
-              <w:start w:w="140" w:type="dxa"/>
-              <w:end w:w="140" w:type="dxa"/>
+              <w:top w:w="60" w:type="dxa"/>
+              <w:bottom w:w="60" w:type="dxa"/>
+              <w:start w:w="120" w:type="dxa"/>
+              <w:end w:w="120" w:type="dxa"/>
             </w:tcMar>
           </w:tcPr>
           <w:p>
+            <w:pPr>
+              <w:spacing w:after="0"/>
+            </w:pPr>
             <w:r>
               <w:rPr>
                 <w:color w:val="201E19"/>
                 <w:sz w:val="19"/>
               </w:rPr>
-              <w:t>Known limitations and unconfirmed licences are disclosed rather than hidden.</w:t>
+              <w:t>Known limitations and licence restrictions (non-commercial use only) are disclosed rather than hidden.</w:t>
             </w:r>
           </w:p>
         </w:tc>
@@ -2196,6 +2435,7 @@
     </w:p>
     <w:p>
       <w:pPr>
+        <w:keepNext/>
         <w:spacing w:before="280" w:after="120"/>
       </w:pPr>
       <w:r>
@@ -2234,13 +2474,16 @@
             <w:tcW w:type="dxa" w:w="2000"/>
             <w:shd w:val="clear" w:color="auto" w:fill="1F3D7A"/>
             <w:tcMar>
-              <w:top w:w="100" w:type="dxa"/>
-              <w:bottom w:w="100" w:type="dxa"/>
-              <w:start w:w="140" w:type="dxa"/>
-              <w:end w:w="140" w:type="dxa"/>
+              <w:top w:w="60" w:type="dxa"/>
+              <w:bottom w:w="60" w:type="dxa"/>
+              <w:start w:w="120" w:type="dxa"/>
+              <w:end w:w="120" w:type="dxa"/>
             </w:tcMar>
           </w:tcPr>
           <w:p>
+            <w:pPr>
+              <w:spacing w:after="0"/>
+            </w:pPr>
             <w:r>
               <w:rPr>
                 <w:b/>
@@ -2257,13 +2500,16 @@
             <w:tcW w:type="dxa" w:w="2400"/>
             <w:shd w:val="clear" w:color="auto" w:fill="1F3D7A"/>
             <w:tcMar>
-              <w:top w:w="100" w:type="dxa"/>
-              <w:bottom w:w="100" w:type="dxa"/>
-              <w:start w:w="140" w:type="dxa"/>
-              <w:end w:w="140" w:type="dxa"/>
+              <w:top w:w="60" w:type="dxa"/>
+              <w:bottom w:w="60" w:type="dxa"/>
+              <w:start w:w="120" w:type="dxa"/>
+              <w:end w:w="120" w:type="dxa"/>
             </w:tcMar>
           </w:tcPr>
           <w:p>
+            <w:pPr>
+              <w:spacing w:after="0"/>
+            </w:pPr>
             <w:r>
               <w:rPr>
                 <w:b/>
@@ -2280,13 +2526,16 @@
             <w:tcW w:type="dxa" w:w="2700"/>
             <w:shd w:val="clear" w:color="auto" w:fill="1F3D7A"/>
             <w:tcMar>
-              <w:top w:w="100" w:type="dxa"/>
-              <w:bottom w:w="100" w:type="dxa"/>
-              <w:start w:w="140" w:type="dxa"/>
-              <w:end w:w="140" w:type="dxa"/>
+              <w:top w:w="60" w:type="dxa"/>
+              <w:bottom w:w="60" w:type="dxa"/>
+              <w:start w:w="120" w:type="dxa"/>
+              <w:end w:w="120" w:type="dxa"/>
             </w:tcMar>
           </w:tcPr>
           <w:p>
+            <w:pPr>
+              <w:spacing w:after="0"/>
+            </w:pPr>
             <w:r>
               <w:rPr>
                 <w:b/>
@@ -2303,13 +2552,16 @@
             <w:tcW w:type="dxa" w:w="2872"/>
             <w:shd w:val="clear" w:color="auto" w:fill="1F3D7A"/>
             <w:tcMar>
-              <w:top w:w="100" w:type="dxa"/>
-              <w:bottom w:w="100" w:type="dxa"/>
-              <w:start w:w="140" w:type="dxa"/>
-              <w:end w:w="140" w:type="dxa"/>
+              <w:top w:w="60" w:type="dxa"/>
+              <w:bottom w:w="60" w:type="dxa"/>
+              <w:start w:w="120" w:type="dxa"/>
+              <w:end w:w="120" w:type="dxa"/>
             </w:tcMar>
           </w:tcPr>
           <w:p>
+            <w:pPr>
+              <w:spacing w:after="0"/>
+            </w:pPr>
             <w:r>
               <w:rPr>
                 <w:b/>
@@ -2328,13 +2580,16 @@
             <w:tcW w:type="dxa" w:w="2000"/>
             <w:shd w:val="clear" w:color="auto" w:fill="FFFFFF"/>
             <w:tcMar>
-              <w:top w:w="100" w:type="dxa"/>
-              <w:bottom w:w="100" w:type="dxa"/>
-              <w:start w:w="140" w:type="dxa"/>
-              <w:end w:w="140" w:type="dxa"/>
+              <w:top w:w="60" w:type="dxa"/>
+              <w:bottom w:w="60" w:type="dxa"/>
+              <w:start w:w="120" w:type="dxa"/>
+              <w:end w:w="120" w:type="dxa"/>
             </w:tcMar>
           </w:tcPr>
           <w:p>
+            <w:pPr>
+              <w:spacing w:after="0"/>
+            </w:pPr>
             <w:r>
               <w:rPr>
                 <w:color w:val="201E19"/>
@@ -2350,13 +2605,16 @@
             <w:tcW w:type="dxa" w:w="2400"/>
             <w:shd w:val="clear" w:color="auto" w:fill="FFFFFF"/>
             <w:tcMar>
-              <w:top w:w="100" w:type="dxa"/>
-              <w:bottom w:w="100" w:type="dxa"/>
-              <w:start w:w="140" w:type="dxa"/>
-              <w:end w:w="140" w:type="dxa"/>
+              <w:top w:w="60" w:type="dxa"/>
+              <w:bottom w:w="60" w:type="dxa"/>
+              <w:start w:w="120" w:type="dxa"/>
+              <w:end w:w="120" w:type="dxa"/>
             </w:tcMar>
           </w:tcPr>
           <w:p>
+            <w:pPr>
+              <w:spacing w:after="0"/>
+            </w:pPr>
             <w:r>
               <w:rPr>
                 <w:color w:val="201E19"/>
@@ -2372,13 +2630,16 @@
             <w:tcW w:type="dxa" w:w="2700"/>
             <w:shd w:val="clear" w:color="auto" w:fill="FFFFFF"/>
             <w:tcMar>
-              <w:top w:w="100" w:type="dxa"/>
-              <w:bottom w:w="100" w:type="dxa"/>
-              <w:start w:w="140" w:type="dxa"/>
-              <w:end w:w="140" w:type="dxa"/>
+              <w:top w:w="60" w:type="dxa"/>
+              <w:bottom w:w="60" w:type="dxa"/>
+              <w:start w:w="120" w:type="dxa"/>
+              <w:end w:w="120" w:type="dxa"/>
             </w:tcMar>
           </w:tcPr>
           <w:p>
+            <w:pPr>
+              <w:spacing w:after="0"/>
+            </w:pPr>
             <w:r>
               <w:rPr>
                 <w:color w:val="201E19"/>
@@ -2394,13 +2655,16 @@
             <w:tcW w:type="dxa" w:w="2872"/>
             <w:shd w:val="clear" w:color="auto" w:fill="FFFFFF"/>
             <w:tcMar>
-              <w:top w:w="100" w:type="dxa"/>
-              <w:bottom w:w="100" w:type="dxa"/>
-              <w:start w:w="140" w:type="dxa"/>
-              <w:end w:w="140" w:type="dxa"/>
+              <w:top w:w="60" w:type="dxa"/>
+              <w:bottom w:w="60" w:type="dxa"/>
+              <w:start w:w="120" w:type="dxa"/>
+              <w:end w:w="120" w:type="dxa"/>
             </w:tcMar>
           </w:tcPr>
           <w:p>
+            <w:pPr>
+              <w:spacing w:after="0"/>
+            </w:pPr>
             <w:r>
               <w:rPr>
                 <w:color w:val="201E19"/>
@@ -2418,13 +2682,16 @@
             <w:tcW w:type="dxa" w:w="2000"/>
             <w:shd w:val="clear" w:color="auto" w:fill="FFFFFF"/>
             <w:tcMar>
-              <w:top w:w="100" w:type="dxa"/>
-              <w:bottom w:w="100" w:type="dxa"/>
-              <w:start w:w="140" w:type="dxa"/>
-              <w:end w:w="140" w:type="dxa"/>
+              <w:top w:w="60" w:type="dxa"/>
+              <w:bottom w:w="60" w:type="dxa"/>
+              <w:start w:w="120" w:type="dxa"/>
+              <w:end w:w="120" w:type="dxa"/>
             </w:tcMar>
           </w:tcPr>
           <w:p>
+            <w:pPr>
+              <w:spacing w:after="0"/>
+            </w:pPr>
             <w:r>
               <w:rPr>
                 <w:color w:val="201E19"/>
@@ -2440,13 +2707,16 @@
             <w:tcW w:type="dxa" w:w="2400"/>
             <w:shd w:val="clear" w:color="auto" w:fill="FFFFFF"/>
             <w:tcMar>
-              <w:top w:w="100" w:type="dxa"/>
-              <w:bottom w:w="100" w:type="dxa"/>
-              <w:start w:w="140" w:type="dxa"/>
-              <w:end w:w="140" w:type="dxa"/>
+              <w:top w:w="60" w:type="dxa"/>
+              <w:bottom w:w="60" w:type="dxa"/>
+              <w:start w:w="120" w:type="dxa"/>
+              <w:end w:w="120" w:type="dxa"/>
             </w:tcMar>
           </w:tcPr>
           <w:p>
+            <w:pPr>
+              <w:spacing w:after="0"/>
+            </w:pPr>
             <w:r>
               <w:rPr>
                 <w:color w:val="201E19"/>
@@ -2462,13 +2732,16 @@
             <w:tcW w:type="dxa" w:w="2700"/>
             <w:shd w:val="clear" w:color="auto" w:fill="FFFFFF"/>
             <w:tcMar>
-              <w:top w:w="100" w:type="dxa"/>
-              <w:bottom w:w="100" w:type="dxa"/>
-              <w:start w:w="140" w:type="dxa"/>
-              <w:end w:w="140" w:type="dxa"/>
+              <w:top w:w="60" w:type="dxa"/>
+              <w:bottom w:w="60" w:type="dxa"/>
+              <w:start w:w="120" w:type="dxa"/>
+              <w:end w:w="120" w:type="dxa"/>
             </w:tcMar>
           </w:tcPr>
           <w:p>
+            <w:pPr>
+              <w:spacing w:after="0"/>
+            </w:pPr>
             <w:r>
               <w:rPr>
                 <w:color w:val="201E19"/>
@@ -2484,13 +2757,16 @@
             <w:tcW w:type="dxa" w:w="2872"/>
             <w:shd w:val="clear" w:color="auto" w:fill="FFFFFF"/>
             <w:tcMar>
-              <w:top w:w="100" w:type="dxa"/>
-              <w:bottom w:w="100" w:type="dxa"/>
-              <w:start w:w="140" w:type="dxa"/>
-              <w:end w:w="140" w:type="dxa"/>
+              <w:top w:w="60" w:type="dxa"/>
+              <w:bottom w:w="60" w:type="dxa"/>
+              <w:start w:w="120" w:type="dxa"/>
+              <w:end w:w="120" w:type="dxa"/>
             </w:tcMar>
           </w:tcPr>
           <w:p>
+            <w:pPr>
+              <w:spacing w:after="0"/>
+            </w:pPr>
             <w:r>
               <w:rPr>
                 <w:color w:val="201E19"/>
@@ -2508,13 +2784,16 @@
             <w:tcW w:type="dxa" w:w="2000"/>
             <w:shd w:val="clear" w:color="auto" w:fill="FFFFFF"/>
             <w:tcMar>
-              <w:top w:w="100" w:type="dxa"/>
-              <w:bottom w:w="100" w:type="dxa"/>
-              <w:start w:w="140" w:type="dxa"/>
-              <w:end w:w="140" w:type="dxa"/>
+              <w:top w:w="60" w:type="dxa"/>
+              <w:bottom w:w="60" w:type="dxa"/>
+              <w:start w:w="120" w:type="dxa"/>
+              <w:end w:w="120" w:type="dxa"/>
             </w:tcMar>
           </w:tcPr>
           <w:p>
+            <w:pPr>
+              <w:spacing w:after="0"/>
+            </w:pPr>
             <w:r>
               <w:rPr>
                 <w:color w:val="201E19"/>
@@ -2530,13 +2809,16 @@
             <w:tcW w:type="dxa" w:w="2400"/>
             <w:shd w:val="clear" w:color="auto" w:fill="FFFFFF"/>
             <w:tcMar>
-              <w:top w:w="100" w:type="dxa"/>
-              <w:bottom w:w="100" w:type="dxa"/>
-              <w:start w:w="140" w:type="dxa"/>
-              <w:end w:w="140" w:type="dxa"/>
+              <w:top w:w="60" w:type="dxa"/>
+              <w:bottom w:w="60" w:type="dxa"/>
+              <w:start w:w="120" w:type="dxa"/>
+              <w:end w:w="120" w:type="dxa"/>
             </w:tcMar>
           </w:tcPr>
           <w:p>
+            <w:pPr>
+              <w:spacing w:after="0"/>
+            </w:pPr>
             <w:r>
               <w:rPr>
                 <w:color w:val="201E19"/>
@@ -2552,13 +2834,16 @@
             <w:tcW w:type="dxa" w:w="2700"/>
             <w:shd w:val="clear" w:color="auto" w:fill="FFFFFF"/>
             <w:tcMar>
-              <w:top w:w="100" w:type="dxa"/>
-              <w:bottom w:w="100" w:type="dxa"/>
-              <w:start w:w="140" w:type="dxa"/>
-              <w:end w:w="140" w:type="dxa"/>
+              <w:top w:w="60" w:type="dxa"/>
+              <w:bottom w:w="60" w:type="dxa"/>
+              <w:start w:w="120" w:type="dxa"/>
+              <w:end w:w="120" w:type="dxa"/>
             </w:tcMar>
           </w:tcPr>
           <w:p>
+            <w:pPr>
+              <w:spacing w:after="0"/>
+            </w:pPr>
             <w:r>
               <w:rPr>
                 <w:color w:val="201E19"/>
@@ -2574,13 +2859,16 @@
             <w:tcW w:type="dxa" w:w="2872"/>
             <w:shd w:val="clear" w:color="auto" w:fill="FFFFFF"/>
             <w:tcMar>
-              <w:top w:w="100" w:type="dxa"/>
-              <w:bottom w:w="100" w:type="dxa"/>
-              <w:start w:w="140" w:type="dxa"/>
-              <w:end w:w="140" w:type="dxa"/>
+              <w:top w:w="60" w:type="dxa"/>
+              <w:bottom w:w="60" w:type="dxa"/>
+              <w:start w:w="120" w:type="dxa"/>
+              <w:end w:w="120" w:type="dxa"/>
             </w:tcMar>
           </w:tcPr>
           <w:p>
+            <w:pPr>
+              <w:spacing w:after="0"/>
+            </w:pPr>
             <w:r>
               <w:rPr>
                 <w:color w:val="201E19"/>
@@ -2598,13 +2886,16 @@
             <w:tcW w:type="dxa" w:w="2000"/>
             <w:shd w:val="clear" w:color="auto" w:fill="FFFFFF"/>
             <w:tcMar>
-              <w:top w:w="100" w:type="dxa"/>
-              <w:bottom w:w="100" w:type="dxa"/>
-              <w:start w:w="140" w:type="dxa"/>
-              <w:end w:w="140" w:type="dxa"/>
+              <w:top w:w="60" w:type="dxa"/>
+              <w:bottom w:w="60" w:type="dxa"/>
+              <w:start w:w="120" w:type="dxa"/>
+              <w:end w:w="120" w:type="dxa"/>
             </w:tcMar>
           </w:tcPr>
           <w:p>
+            <w:pPr>
+              <w:spacing w:after="0"/>
+            </w:pPr>
             <w:r>
               <w:rPr>
                 <w:color w:val="201E19"/>
@@ -2620,13 +2911,16 @@
             <w:tcW w:type="dxa" w:w="2400"/>
             <w:shd w:val="clear" w:color="auto" w:fill="FFFFFF"/>
             <w:tcMar>
-              <w:top w:w="100" w:type="dxa"/>
-              <w:bottom w:w="100" w:type="dxa"/>
-              <w:start w:w="140" w:type="dxa"/>
-              <w:end w:w="140" w:type="dxa"/>
+              <w:top w:w="60" w:type="dxa"/>
+              <w:bottom w:w="60" w:type="dxa"/>
+              <w:start w:w="120" w:type="dxa"/>
+              <w:end w:w="120" w:type="dxa"/>
             </w:tcMar>
           </w:tcPr>
           <w:p>
+            <w:pPr>
+              <w:spacing w:after="0"/>
+            </w:pPr>
             <w:r>
               <w:rPr>
                 <w:color w:val="201E19"/>
@@ -2642,13 +2936,16 @@
             <w:tcW w:type="dxa" w:w="2700"/>
             <w:shd w:val="clear" w:color="auto" w:fill="FFFFFF"/>
             <w:tcMar>
-              <w:top w:w="100" w:type="dxa"/>
-              <w:bottom w:w="100" w:type="dxa"/>
-              <w:start w:w="140" w:type="dxa"/>
-              <w:end w:w="140" w:type="dxa"/>
+              <w:top w:w="60" w:type="dxa"/>
+              <w:bottom w:w="60" w:type="dxa"/>
+              <w:start w:w="120" w:type="dxa"/>
+              <w:end w:w="120" w:type="dxa"/>
             </w:tcMar>
           </w:tcPr>
           <w:p>
+            <w:pPr>
+              <w:spacing w:after="0"/>
+            </w:pPr>
             <w:r>
               <w:rPr>
                 <w:color w:val="201E19"/>
@@ -2664,13 +2961,16 @@
             <w:tcW w:type="dxa" w:w="2872"/>
             <w:shd w:val="clear" w:color="auto" w:fill="FFFFFF"/>
             <w:tcMar>
-              <w:top w:w="100" w:type="dxa"/>
-              <w:bottom w:w="100" w:type="dxa"/>
-              <w:start w:w="140" w:type="dxa"/>
-              <w:end w:w="140" w:type="dxa"/>
+              <w:top w:w="60" w:type="dxa"/>
+              <w:bottom w:w="60" w:type="dxa"/>
+              <w:start w:w="120" w:type="dxa"/>
+              <w:end w:w="120" w:type="dxa"/>
             </w:tcMar>
           </w:tcPr>
           <w:p>
+            <w:pPr>
+              <w:spacing w:after="0"/>
+            </w:pPr>
             <w:r>
               <w:rPr>
                 <w:color w:val="201E19"/>
@@ -2688,13 +2988,16 @@
             <w:tcW w:type="dxa" w:w="2000"/>
             <w:shd w:val="clear" w:color="auto" w:fill="FFFFFF"/>
             <w:tcMar>
-              <w:top w:w="100" w:type="dxa"/>
-              <w:bottom w:w="100" w:type="dxa"/>
-              <w:start w:w="140" w:type="dxa"/>
-              <w:end w:w="140" w:type="dxa"/>
+              <w:top w:w="60" w:type="dxa"/>
+              <w:bottom w:w="60" w:type="dxa"/>
+              <w:start w:w="120" w:type="dxa"/>
+              <w:end w:w="120" w:type="dxa"/>
             </w:tcMar>
           </w:tcPr>
           <w:p>
+            <w:pPr>
+              <w:spacing w:after="0"/>
+            </w:pPr>
             <w:r>
               <w:rPr>
                 <w:color w:val="201E19"/>
@@ -2710,13 +3013,16 @@
             <w:tcW w:type="dxa" w:w="2400"/>
             <w:shd w:val="clear" w:color="auto" w:fill="FFFFFF"/>
             <w:tcMar>
-              <w:top w:w="100" w:type="dxa"/>
-              <w:bottom w:w="100" w:type="dxa"/>
-              <w:start w:w="140" w:type="dxa"/>
-              <w:end w:w="140" w:type="dxa"/>
+              <w:top w:w="60" w:type="dxa"/>
+              <w:bottom w:w="60" w:type="dxa"/>
+              <w:start w:w="120" w:type="dxa"/>
+              <w:end w:w="120" w:type="dxa"/>
             </w:tcMar>
           </w:tcPr>
           <w:p>
+            <w:pPr>
+              <w:spacing w:after="0"/>
+            </w:pPr>
             <w:r>
               <w:rPr>
                 <w:color w:val="201E19"/>
@@ -2732,13 +3038,16 @@
             <w:tcW w:type="dxa" w:w="2700"/>
             <w:shd w:val="clear" w:color="auto" w:fill="FFFFFF"/>
             <w:tcMar>
-              <w:top w:w="100" w:type="dxa"/>
-              <w:bottom w:w="100" w:type="dxa"/>
-              <w:start w:w="140" w:type="dxa"/>
-              <w:end w:w="140" w:type="dxa"/>
+              <w:top w:w="60" w:type="dxa"/>
+              <w:bottom w:w="60" w:type="dxa"/>
+              <w:start w:w="120" w:type="dxa"/>
+              <w:end w:w="120" w:type="dxa"/>
             </w:tcMar>
           </w:tcPr>
           <w:p>
+            <w:pPr>
+              <w:spacing w:after="0"/>
+            </w:pPr>
             <w:r>
               <w:rPr>
                 <w:color w:val="201E19"/>
@@ -2754,13 +3063,16 @@
             <w:tcW w:type="dxa" w:w="2872"/>
             <w:shd w:val="clear" w:color="auto" w:fill="FFFFFF"/>
             <w:tcMar>
-              <w:top w:w="100" w:type="dxa"/>
-              <w:bottom w:w="100" w:type="dxa"/>
-              <w:start w:w="140" w:type="dxa"/>
-              <w:end w:w="140" w:type="dxa"/>
+              <w:top w:w="60" w:type="dxa"/>
+              <w:bottom w:w="60" w:type="dxa"/>
+              <w:start w:w="120" w:type="dxa"/>
+              <w:end w:w="120" w:type="dxa"/>
             </w:tcMar>
           </w:tcPr>
           <w:p>
+            <w:pPr>
+              <w:spacing w:after="0"/>
+            </w:pPr>
             <w:r>
               <w:rPr>
                 <w:color w:val="201E19"/>
@@ -2778,13 +3090,16 @@
             <w:tcW w:type="dxa" w:w="2000"/>
             <w:shd w:val="clear" w:color="auto" w:fill="FFFFFF"/>
             <w:tcMar>
-              <w:top w:w="100" w:type="dxa"/>
-              <w:bottom w:w="100" w:type="dxa"/>
-              <w:start w:w="140" w:type="dxa"/>
-              <w:end w:w="140" w:type="dxa"/>
+              <w:top w:w="60" w:type="dxa"/>
+              <w:bottom w:w="60" w:type="dxa"/>
+              <w:start w:w="120" w:type="dxa"/>
+              <w:end w:w="120" w:type="dxa"/>
             </w:tcMar>
           </w:tcPr>
           <w:p>
+            <w:pPr>
+              <w:spacing w:after="0"/>
+            </w:pPr>
             <w:r>
               <w:rPr>
                 <w:color w:val="201E19"/>
@@ -2800,13 +3115,16 @@
             <w:tcW w:type="dxa" w:w="2400"/>
             <w:shd w:val="clear" w:color="auto" w:fill="FFFFFF"/>
             <w:tcMar>
-              <w:top w:w="100" w:type="dxa"/>
-              <w:bottom w:w="100" w:type="dxa"/>
-              <w:start w:w="140" w:type="dxa"/>
-              <w:end w:w="140" w:type="dxa"/>
+              <w:top w:w="60" w:type="dxa"/>
+              <w:bottom w:w="60" w:type="dxa"/>
+              <w:start w:w="120" w:type="dxa"/>
+              <w:end w:w="120" w:type="dxa"/>
             </w:tcMar>
           </w:tcPr>
           <w:p>
+            <w:pPr>
+              <w:spacing w:after="0"/>
+            </w:pPr>
             <w:r>
               <w:rPr>
                 <w:color w:val="201E19"/>
@@ -2822,13 +3140,16 @@
             <w:tcW w:type="dxa" w:w="2700"/>
             <w:shd w:val="clear" w:color="auto" w:fill="FFFFFF"/>
             <w:tcMar>
-              <w:top w:w="100" w:type="dxa"/>
-              <w:bottom w:w="100" w:type="dxa"/>
-              <w:start w:w="140" w:type="dxa"/>
-              <w:end w:w="140" w:type="dxa"/>
+              <w:top w:w="60" w:type="dxa"/>
+              <w:bottom w:w="60" w:type="dxa"/>
+              <w:start w:w="120" w:type="dxa"/>
+              <w:end w:w="120" w:type="dxa"/>
             </w:tcMar>
           </w:tcPr>
           <w:p>
+            <w:pPr>
+              <w:spacing w:after="0"/>
+            </w:pPr>
             <w:r>
               <w:rPr>
                 <w:color w:val="201E19"/>
@@ -2844,13 +3165,16 @@
             <w:tcW w:type="dxa" w:w="2872"/>
             <w:shd w:val="clear" w:color="auto" w:fill="FFFFFF"/>
             <w:tcMar>
-              <w:top w:w="100" w:type="dxa"/>
-              <w:bottom w:w="100" w:type="dxa"/>
-              <w:start w:w="140" w:type="dxa"/>
-              <w:end w:w="140" w:type="dxa"/>
+              <w:top w:w="60" w:type="dxa"/>
+              <w:bottom w:w="60" w:type="dxa"/>
+              <w:start w:w="120" w:type="dxa"/>
+              <w:end w:w="120" w:type="dxa"/>
             </w:tcMar>
           </w:tcPr>
           <w:p>
+            <w:pPr>
+              <w:spacing w:after="0"/>
+            </w:pPr>
             <w:r>
               <w:rPr>
                 <w:color w:val="201E19"/>
@@ -2882,6 +3206,7 @@
     </w:p>
     <w:p>
       <w:pPr>
+        <w:keepNext/>
         <w:spacing w:before="280" w:after="120"/>
       </w:pPr>
       <w:r>
@@ -2918,13 +3243,16 @@
             <w:tcW w:type="dxa" w:w="2600"/>
             <w:shd w:val="clear" w:color="auto" w:fill="1F3D7A"/>
             <w:tcMar>
-              <w:top w:w="100" w:type="dxa"/>
-              <w:bottom w:w="100" w:type="dxa"/>
-              <w:start w:w="140" w:type="dxa"/>
-              <w:end w:w="140" w:type="dxa"/>
+              <w:top w:w="60" w:type="dxa"/>
+              <w:bottom w:w="60" w:type="dxa"/>
+              <w:start w:w="120" w:type="dxa"/>
+              <w:end w:w="120" w:type="dxa"/>
             </w:tcMar>
           </w:tcPr>
           <w:p>
+            <w:pPr>
+              <w:spacing w:after="0"/>
+            </w:pPr>
             <w:r>
               <w:rPr>
                 <w:b/>
@@ -2941,13 +3269,16 @@
             <w:tcW w:type="dxa" w:w="7372"/>
             <w:shd w:val="clear" w:color="auto" w:fill="1F3D7A"/>
             <w:tcMar>
-              <w:top w:w="100" w:type="dxa"/>
-              <w:bottom w:w="100" w:type="dxa"/>
-              <w:start w:w="140" w:type="dxa"/>
-              <w:end w:w="140" w:type="dxa"/>
+              <w:top w:w="60" w:type="dxa"/>
+              <w:bottom w:w="60" w:type="dxa"/>
+              <w:start w:w="120" w:type="dxa"/>
+              <w:end w:w="120" w:type="dxa"/>
             </w:tcMar>
           </w:tcPr>
           <w:p>
+            <w:pPr>
+              <w:spacing w:after="0"/>
+            </w:pPr>
             <w:r>
               <w:rPr>
                 <w:b/>
@@ -2966,13 +3297,16 @@
             <w:tcW w:type="dxa" w:w="2600"/>
             <w:shd w:val="clear" w:color="auto" w:fill="FFFFFF"/>
             <w:tcMar>
-              <w:top w:w="100" w:type="dxa"/>
-              <w:bottom w:w="100" w:type="dxa"/>
-              <w:start w:w="140" w:type="dxa"/>
-              <w:end w:w="140" w:type="dxa"/>
+              <w:top w:w="60" w:type="dxa"/>
+              <w:bottom w:w="60" w:type="dxa"/>
+              <w:start w:w="120" w:type="dxa"/>
+              <w:end w:w="120" w:type="dxa"/>
             </w:tcMar>
           </w:tcPr>
           <w:p>
+            <w:pPr>
+              <w:spacing w:after="0"/>
+            </w:pPr>
             <w:r>
               <w:rPr>
                 <w:color w:val="201E19"/>
@@ -2988,13 +3322,16 @@
             <w:tcW w:type="dxa" w:w="7372"/>
             <w:shd w:val="clear" w:color="auto" w:fill="FFFFFF"/>
             <w:tcMar>
-              <w:top w:w="100" w:type="dxa"/>
-              <w:bottom w:w="100" w:type="dxa"/>
-              <w:start w:w="140" w:type="dxa"/>
-              <w:end w:w="140" w:type="dxa"/>
+              <w:top w:w="60" w:type="dxa"/>
+              <w:bottom w:w="60" w:type="dxa"/>
+              <w:start w:w="120" w:type="dxa"/>
+              <w:end w:w="120" w:type="dxa"/>
             </w:tcMar>
           </w:tcPr>
           <w:p>
+            <w:pPr>
+              <w:spacing w:after="0"/>
+            </w:pPr>
             <w:r>
               <w:rPr>
                 <w:color w:val="201E19"/>
@@ -3012,13 +3349,16 @@
             <w:tcW w:type="dxa" w:w="2600"/>
             <w:shd w:val="clear" w:color="auto" w:fill="FFFFFF"/>
             <w:tcMar>
-              <w:top w:w="100" w:type="dxa"/>
-              <w:bottom w:w="100" w:type="dxa"/>
-              <w:start w:w="140" w:type="dxa"/>
-              <w:end w:w="140" w:type="dxa"/>
+              <w:top w:w="60" w:type="dxa"/>
+              <w:bottom w:w="60" w:type="dxa"/>
+              <w:start w:w="120" w:type="dxa"/>
+              <w:end w:w="120" w:type="dxa"/>
             </w:tcMar>
           </w:tcPr>
           <w:p>
+            <w:pPr>
+              <w:spacing w:after="0"/>
+            </w:pPr>
             <w:r>
               <w:rPr>
                 <w:color w:val="201E19"/>
@@ -3034,13 +3374,16 @@
             <w:tcW w:type="dxa" w:w="7372"/>
             <w:shd w:val="clear" w:color="auto" w:fill="FFFFFF"/>
             <w:tcMar>
-              <w:top w:w="100" w:type="dxa"/>
-              <w:bottom w:w="100" w:type="dxa"/>
-              <w:start w:w="140" w:type="dxa"/>
-              <w:end w:w="140" w:type="dxa"/>
+              <w:top w:w="60" w:type="dxa"/>
+              <w:bottom w:w="60" w:type="dxa"/>
+              <w:start w:w="120" w:type="dxa"/>
+              <w:end w:w="120" w:type="dxa"/>
             </w:tcMar>
           </w:tcPr>
           <w:p>
+            <w:pPr>
+              <w:spacing w:after="0"/>
+            </w:pPr>
             <w:r>
               <w:rPr>
                 <w:color w:val="201E19"/>
@@ -3059,6 +3402,7 @@
     </w:p>
     <w:p>
       <w:pPr>
+        <w:keepNext/>
         <w:spacing w:before="280" w:after="120"/>
       </w:pPr>
       <w:r>
@@ -3095,13 +3439,16 @@
             <w:tcW w:type="dxa" w:w="3400"/>
             <w:shd w:val="clear" w:color="auto" w:fill="1F3D7A"/>
             <w:tcMar>
-              <w:top w:w="100" w:type="dxa"/>
-              <w:bottom w:w="100" w:type="dxa"/>
-              <w:start w:w="140" w:type="dxa"/>
-              <w:end w:w="140" w:type="dxa"/>
+              <w:top w:w="60" w:type="dxa"/>
+              <w:bottom w:w="60" w:type="dxa"/>
+              <w:start w:w="120" w:type="dxa"/>
+              <w:end w:w="120" w:type="dxa"/>
             </w:tcMar>
           </w:tcPr>
           <w:p>
+            <w:pPr>
+              <w:spacing w:after="0"/>
+            </w:pPr>
             <w:r>
               <w:rPr>
                 <w:b/>
@@ -3118,13 +3465,16 @@
             <w:tcW w:type="dxa" w:w="6572"/>
             <w:shd w:val="clear" w:color="auto" w:fill="1F3D7A"/>
             <w:tcMar>
-              <w:top w:w="100" w:type="dxa"/>
-              <w:bottom w:w="100" w:type="dxa"/>
-              <w:start w:w="140" w:type="dxa"/>
-              <w:end w:w="140" w:type="dxa"/>
+              <w:top w:w="60" w:type="dxa"/>
+              <w:bottom w:w="60" w:type="dxa"/>
+              <w:start w:w="120" w:type="dxa"/>
+              <w:end w:w="120" w:type="dxa"/>
             </w:tcMar>
           </w:tcPr>
           <w:p>
+            <w:pPr>
+              <w:spacing w:after="0"/>
+            </w:pPr>
             <w:r>
               <w:rPr>
                 <w:b/>
@@ -3143,13 +3493,16 @@
             <w:tcW w:type="dxa" w:w="3400"/>
             <w:shd w:val="clear" w:color="auto" w:fill="FFFFFF"/>
             <w:tcMar>
-              <w:top w:w="100" w:type="dxa"/>
-              <w:bottom w:w="100" w:type="dxa"/>
-              <w:start w:w="140" w:type="dxa"/>
-              <w:end w:w="140" w:type="dxa"/>
+              <w:top w:w="60" w:type="dxa"/>
+              <w:bottom w:w="60" w:type="dxa"/>
+              <w:start w:w="120" w:type="dxa"/>
+              <w:end w:w="120" w:type="dxa"/>
             </w:tcMar>
           </w:tcPr>
           <w:p>
+            <w:pPr>
+              <w:spacing w:after="0"/>
+            </w:pPr>
             <w:r>
               <w:rPr>
                 <w:color w:val="201E19"/>
@@ -3165,19 +3518,22 @@
             <w:tcW w:type="dxa" w:w="6572"/>
             <w:shd w:val="clear" w:color="auto" w:fill="FFFFFF"/>
             <w:tcMar>
-              <w:top w:w="100" w:type="dxa"/>
-              <w:bottom w:w="100" w:type="dxa"/>
-              <w:start w:w="140" w:type="dxa"/>
-              <w:end w:w="140" w:type="dxa"/>
+              <w:top w:w="60" w:type="dxa"/>
+              <w:bottom w:w="60" w:type="dxa"/>
+              <w:start w:w="120" w:type="dxa"/>
+              <w:end w:w="120" w:type="dxa"/>
             </w:tcMar>
           </w:tcPr>
           <w:p>
+            <w:pPr>
+              <w:spacing w:after="0"/>
+            </w:pPr>
             <w:r>
               <w:rPr>
                 <w:color w:val="201E19"/>
                 <w:sz w:val="19"/>
               </w:rPr>
-              <w:t>https://handmirror.vercel.app</w:t>
+              <w:t>https://handmirror.vercel.app -- public, no login or password</w:t>
             </w:r>
           </w:p>
         </w:tc>
@@ -3189,13 +3545,16 @@
             <w:tcW w:type="dxa" w:w="3400"/>
             <w:shd w:val="clear" w:color="auto" w:fill="FFFFFF"/>
             <w:tcMar>
-              <w:top w:w="100" w:type="dxa"/>
-              <w:bottom w:w="100" w:type="dxa"/>
-              <w:start w:w="140" w:type="dxa"/>
-              <w:end w:w="140" w:type="dxa"/>
+              <w:top w:w="60" w:type="dxa"/>
+              <w:bottom w:w="60" w:type="dxa"/>
+              <w:start w:w="120" w:type="dxa"/>
+              <w:end w:w="120" w:type="dxa"/>
             </w:tcMar>
           </w:tcPr>
           <w:p>
+            <w:pPr>
+              <w:spacing w:after="0"/>
+            </w:pPr>
             <w:r>
               <w:rPr>
                 <w:color w:val="201E19"/>
@@ -3211,13 +3570,16 @@
             <w:tcW w:type="dxa" w:w="6572"/>
             <w:shd w:val="clear" w:color="auto" w:fill="FFFFFF"/>
             <w:tcMar>
-              <w:top w:w="100" w:type="dxa"/>
-              <w:bottom w:w="100" w:type="dxa"/>
-              <w:start w:w="140" w:type="dxa"/>
-              <w:end w:w="140" w:type="dxa"/>
+              <w:top w:w="60" w:type="dxa"/>
+              <w:bottom w:w="60" w:type="dxa"/>
+              <w:start w:w="120" w:type="dxa"/>
+              <w:end w:w="120" w:type="dxa"/>
             </w:tcMar>
           </w:tcPr>
           <w:p>
+            <w:pPr>
+              <w:spacing w:after="0"/>
+            </w:pPr>
             <w:r>
               <w:rPr>
                 <w:color w:val="201E19"/>
@@ -3235,19 +3597,22 @@
             <w:tcW w:type="dxa" w:w="3400"/>
             <w:shd w:val="clear" w:color="auto" w:fill="FFFFFF"/>
             <w:tcMar>
-              <w:top w:w="100" w:type="dxa"/>
-              <w:bottom w:w="100" w:type="dxa"/>
-              <w:start w:w="140" w:type="dxa"/>
-              <w:end w:w="140" w:type="dxa"/>
+              <w:top w:w="60" w:type="dxa"/>
+              <w:bottom w:w="60" w:type="dxa"/>
+              <w:start w:w="120" w:type="dxa"/>
+              <w:end w:w="120" w:type="dxa"/>
             </w:tcMar>
           </w:tcPr>
           <w:p>
+            <w:pPr>
+              <w:spacing w:after="0"/>
+            </w:pPr>
             <w:r>
               <w:rPr>
                 <w:color w:val="201E19"/>
                 <w:sz w:val="19"/>
               </w:rPr>
-              <w:t>System Architecture Document</w:t>
+              <w:t>System architecture</w:t>
             </w:r>
           </w:p>
         </w:tc>
@@ -3257,19 +3622,22 @@
             <w:tcW w:type="dxa" w:w="6572"/>
             <w:shd w:val="clear" w:color="auto" w:fill="FFFFFF"/>
             <w:tcMar>
-              <w:top w:w="100" w:type="dxa"/>
-              <w:bottom w:w="100" w:type="dxa"/>
-              <w:start w:w="140" w:type="dxa"/>
-              <w:end w:w="140" w:type="dxa"/>
+              <w:top w:w="60" w:type="dxa"/>
+              <w:bottom w:w="60" w:type="dxa"/>
+              <w:start w:w="120" w:type="dxa"/>
+              <w:end w:w="120" w:type="dxa"/>
             </w:tcMar>
           </w:tcPr>
           <w:p>
+            <w:pPr>
+              <w:spacing w:after="0"/>
+            </w:pPr>
             <w:r>
               <w:rPr>
                 <w:color w:val="201E19"/>
                 <w:sz w:val="19"/>
               </w:rPr>
-              <w:t>website/docs/system-architecture.docx (predates Practice, the 3D avatar and Sign Chat -- see the Maintenance Document)</w:t>
+              <w:t>Current diagram: Support Document, Section 3 (and Maintenance Document, Section 2); earlier write-up in website/docs/system-architecture.docx</w:t>
             </w:r>
           </w:p>
         </w:tc>
@@ -3281,13 +3649,16 @@
             <w:tcW w:type="dxa" w:w="3400"/>
             <w:shd w:val="clear" w:color="auto" w:fill="FFFFFF"/>
             <w:tcMar>
-              <w:top w:w="100" w:type="dxa"/>
-              <w:bottom w:w="100" w:type="dxa"/>
-              <w:start w:w="140" w:type="dxa"/>
-              <w:end w:w="140" w:type="dxa"/>
+              <w:top w:w="60" w:type="dxa"/>
+              <w:bottom w:w="60" w:type="dxa"/>
+              <w:start w:w="120" w:type="dxa"/>
+              <w:end w:w="120" w:type="dxa"/>
             </w:tcMar>
           </w:tcPr>
           <w:p>
+            <w:pPr>
+              <w:spacing w:after="0"/>
+            </w:pPr>
             <w:r>
               <w:rPr>
                 <w:color w:val="201E19"/>
@@ -3303,13 +3674,16 @@
             <w:tcW w:type="dxa" w:w="6572"/>
             <w:shd w:val="clear" w:color="auto" w:fill="FFFFFF"/>
             <w:tcMar>
-              <w:top w:w="100" w:type="dxa"/>
-              <w:bottom w:w="100" w:type="dxa"/>
-              <w:start w:w="140" w:type="dxa"/>
-              <w:end w:w="140" w:type="dxa"/>
+              <w:top w:w="60" w:type="dxa"/>
+              <w:bottom w:w="60" w:type="dxa"/>
+              <w:start w:w="120" w:type="dxa"/>
+              <w:end w:w="120" w:type="dxa"/>
             </w:tcMar>
           </w:tcPr>
           <w:p>
+            <w:pPr>
+              <w:spacing w:after="0"/>
+            </w:pPr>
             <w:r>
               <w:rPr>
                 <w:color w:val="201E19"/>
@@ -3327,13 +3701,16 @@
             <w:tcW w:type="dxa" w:w="3400"/>
             <w:shd w:val="clear" w:color="auto" w:fill="FFFFFF"/>
             <w:tcMar>
-              <w:top w:w="100" w:type="dxa"/>
-              <w:bottom w:w="100" w:type="dxa"/>
-              <w:start w:w="140" w:type="dxa"/>
-              <w:end w:w="140" w:type="dxa"/>
+              <w:top w:w="60" w:type="dxa"/>
+              <w:bottom w:w="60" w:type="dxa"/>
+              <w:start w:w="120" w:type="dxa"/>
+              <w:end w:w="120" w:type="dxa"/>
             </w:tcMar>
           </w:tcPr>
           <w:p>
+            <w:pPr>
+              <w:spacing w:after="0"/>
+            </w:pPr>
             <w:r>
               <w:rPr>
                 <w:color w:val="201E19"/>
@@ -3349,13 +3726,16 @@
             <w:tcW w:type="dxa" w:w="6572"/>
             <w:shd w:val="clear" w:color="auto" w:fill="FFFFFF"/>
             <w:tcMar>
-              <w:top w:w="100" w:type="dxa"/>
-              <w:bottom w:w="100" w:type="dxa"/>
-              <w:start w:w="140" w:type="dxa"/>
-              <w:end w:w="140" w:type="dxa"/>
+              <w:top w:w="60" w:type="dxa"/>
+              <w:bottom w:w="60" w:type="dxa"/>
+              <w:start w:w="120" w:type="dxa"/>
+              <w:end w:w="120" w:type="dxa"/>
             </w:tcMar>
           </w:tcPr>
           <w:p>
+            <w:pPr>
+              <w:spacing w:after="0"/>
+            </w:pPr>
             <w:r>
               <w:rPr>
                 <w:color w:val="201E19"/>
@@ -3373,13 +3753,16 @@
             <w:tcW w:type="dxa" w:w="3400"/>
             <w:shd w:val="clear" w:color="auto" w:fill="FFFFFF"/>
             <w:tcMar>
-              <w:top w:w="100" w:type="dxa"/>
-              <w:bottom w:w="100" w:type="dxa"/>
-              <w:start w:w="140" w:type="dxa"/>
-              <w:end w:w="140" w:type="dxa"/>
+              <w:top w:w="60" w:type="dxa"/>
+              <w:bottom w:w="60" w:type="dxa"/>
+              <w:start w:w="120" w:type="dxa"/>
+              <w:end w:w="120" w:type="dxa"/>
             </w:tcMar>
           </w:tcPr>
           <w:p>
+            <w:pPr>
+              <w:spacing w:after="0"/>
+            </w:pPr>
             <w:r>
               <w:rPr>
                 <w:color w:val="201E19"/>
@@ -3395,13 +3778,16 @@
             <w:tcW w:type="dxa" w:w="6572"/>
             <w:shd w:val="clear" w:color="auto" w:fill="FFFFFF"/>
             <w:tcMar>
-              <w:top w:w="100" w:type="dxa"/>
-              <w:bottom w:w="100" w:type="dxa"/>
-              <w:start w:w="140" w:type="dxa"/>
-              <w:end w:w="140" w:type="dxa"/>
+              <w:top w:w="60" w:type="dxa"/>
+              <w:bottom w:w="60" w:type="dxa"/>
+              <w:start w:w="120" w:type="dxa"/>
+              <w:end w:w="120" w:type="dxa"/>
             </w:tcMar>
           </w:tcPr>
           <w:p>
+            <w:pPr>
+              <w:spacing w:after="0"/>
+            </w:pPr>
             <w:r>
               <w:rPr>
                 <w:color w:val="201E19"/>

</xml_diff>